<commit_message>
Add project review document
</commit_message>
<xml_diff>
--- a/SKIN_CANCER_DETECTION_project_review.docx
+++ b/SKIN_CANCER_DETECTION_project_review.docx
@@ -9,8 +9,8 @@
           <w:rFonts w:ascii="Arial Black" w:hAnsi="Arial Black"/>
           <w:b/>
           <w:bCs/>
-          <w:sz w:val="28"/>
-          <w:szCs w:val="28"/>
+          <w:sz w:val="48"/>
+          <w:szCs w:val="48"/>
         </w:rPr>
       </w:pPr>
       <w:r>
@@ -18,8 +18,8 @@
           <w:rFonts w:ascii="Arial Black" w:hAnsi="Arial Black"/>
           <w:b/>
           <w:bCs/>
-          <w:sz w:val="28"/>
-          <w:szCs w:val="28"/>
+          <w:sz w:val="48"/>
+          <w:szCs w:val="48"/>
         </w:rPr>
         <w:t xml:space="preserve">SKIN CANCER DETECTION </w:t>
       </w:r>
@@ -780,17 +780,74 @@
       <w:pPr>
         <w:spacing w:after="0"/>
         <w:rPr>
-          <w:b/>
-          <w:bCs/>
-          <w:sz w:val="24"/>
-          <w:szCs w:val="24"/>
-        </w:rPr>
-      </w:pPr>
-      <w:r>
-        <w:rPr>
-          <w:sz w:val="24"/>
-          <w:szCs w:val="24"/>
-        </w:rPr>
+          <w:sz w:val="24"/>
+          <w:szCs w:val="24"/>
+        </w:rPr>
+      </w:pPr>
+    </w:p>
+    <w:p>
+      <w:pPr>
+        <w:spacing w:after="0"/>
+        <w:rPr>
+          <w:sz w:val="24"/>
+          <w:szCs w:val="24"/>
+        </w:rPr>
+      </w:pPr>
+    </w:p>
+    <w:p>
+      <w:pPr>
+        <w:spacing w:after="0"/>
+        <w:rPr>
+          <w:sz w:val="24"/>
+          <w:szCs w:val="24"/>
+        </w:rPr>
+      </w:pPr>
+    </w:p>
+    <w:p>
+      <w:pPr>
+        <w:spacing w:after="0"/>
+        <w:rPr>
+          <w:sz w:val="24"/>
+          <w:szCs w:val="24"/>
+        </w:rPr>
+      </w:pPr>
+    </w:p>
+    <w:p>
+      <w:pPr>
+        <w:spacing w:after="0"/>
+        <w:rPr>
+          <w:sz w:val="24"/>
+          <w:szCs w:val="24"/>
+        </w:rPr>
+      </w:pPr>
+    </w:p>
+    <w:p>
+      <w:pPr>
+        <w:spacing w:after="0"/>
+        <w:rPr>
+          <w:sz w:val="24"/>
+          <w:szCs w:val="24"/>
+        </w:rPr>
+      </w:pPr>
+    </w:p>
+    <w:p>
+      <w:pPr>
+        <w:spacing w:after="0"/>
+        <w:rPr>
+          <w:b/>
+          <w:bCs/>
+          <w:sz w:val="24"/>
+          <w:szCs w:val="24"/>
+        </w:rPr>
+      </w:pPr>
+      <w:r>
+        <w:rPr>
+          <w:b/>
+          <w:bCs/>
+          <w:sz w:val="24"/>
+          <w:szCs w:val="24"/>
+        </w:rPr>
+        <w:lastRenderedPageBreak/>
         <w:t>INTERPRETATION OF THE RAW DATA:</w:t>
       </w:r>
     </w:p>
@@ -835,7 +892,7 @@
                     <pic:cNvPicPr/>
                   </pic:nvPicPr>
                   <pic:blipFill>
-                    <a:blip r:embed="rId5"/>
+                    <a:blip r:embed="rId6"/>
                     <a:stretch>
                       <a:fillRect/>
                     </a:stretch>
@@ -858,22 +915,30 @@
     </w:p>
     <w:p>
       <w:pPr>
+        <w:spacing w:after="0"/>
+        <w:ind w:left="720"/>
+        <w:rPr>
+          <w:sz w:val="24"/>
+          <w:szCs w:val="24"/>
+        </w:rPr>
+      </w:pPr>
+    </w:p>
+    <w:p>
+      <w:pPr>
+        <w:spacing w:after="0"/>
+        <w:rPr>
+          <w:sz w:val="24"/>
+          <w:szCs w:val="24"/>
+        </w:rPr>
+      </w:pPr>
+      <w:r>
         <w:rPr>
           <w:b/>
           <w:bCs/>
           <w:sz w:val="28"/>
           <w:szCs w:val="28"/>
         </w:rPr>
-      </w:pPr>
-      <w:r>
-        <w:rPr>
-          <w:b/>
-          <w:bCs/>
-          <w:sz w:val="28"/>
-          <w:szCs w:val="28"/>
-        </w:rPr>
-        <w:lastRenderedPageBreak/>
-        <w:t xml:space="preserve"> EDA Code and Output (Conceptual)</w:t>
+        <w:t>EDA Code and Output (Conceptual)</w:t>
       </w:r>
     </w:p>
     <w:p>
@@ -1033,7 +1098,7 @@
                     <pic:cNvPicPr/>
                   </pic:nvPicPr>
                   <pic:blipFill>
-                    <a:blip r:embed="rId6"/>
+                    <a:blip r:embed="rId7"/>
                     <a:stretch>
                       <a:fillRect/>
                     </a:stretch>
@@ -1123,6 +1188,78 @@
     </w:p>
     <w:p>
       <w:pPr>
+        <w:ind w:left="720"/>
+        <w:rPr>
+          <w:sz w:val="24"/>
+          <w:szCs w:val="24"/>
+        </w:rPr>
+      </w:pPr>
+    </w:p>
+    <w:p>
+      <w:pPr>
+        <w:ind w:left="720"/>
+        <w:rPr>
+          <w:sz w:val="24"/>
+          <w:szCs w:val="24"/>
+        </w:rPr>
+      </w:pPr>
+    </w:p>
+    <w:p>
+      <w:pPr>
+        <w:ind w:left="720"/>
+        <w:rPr>
+          <w:sz w:val="24"/>
+          <w:szCs w:val="24"/>
+        </w:rPr>
+      </w:pPr>
+    </w:p>
+    <w:p>
+      <w:pPr>
+        <w:ind w:left="720"/>
+        <w:rPr>
+          <w:sz w:val="24"/>
+          <w:szCs w:val="24"/>
+        </w:rPr>
+      </w:pPr>
+    </w:p>
+    <w:p>
+      <w:pPr>
+        <w:ind w:left="720"/>
+        <w:rPr>
+          <w:sz w:val="24"/>
+          <w:szCs w:val="24"/>
+        </w:rPr>
+      </w:pPr>
+    </w:p>
+    <w:p>
+      <w:pPr>
+        <w:ind w:left="720"/>
+        <w:rPr>
+          <w:sz w:val="24"/>
+          <w:szCs w:val="24"/>
+        </w:rPr>
+      </w:pPr>
+    </w:p>
+    <w:p>
+      <w:pPr>
+        <w:ind w:left="720"/>
+        <w:rPr>
+          <w:sz w:val="24"/>
+          <w:szCs w:val="24"/>
+        </w:rPr>
+      </w:pPr>
+    </w:p>
+    <w:p>
+      <w:pPr>
+        <w:ind w:left="720"/>
+        <w:rPr>
+          <w:sz w:val="24"/>
+          <w:szCs w:val="24"/>
+        </w:rPr>
+      </w:pPr>
+    </w:p>
+    <w:p>
+      <w:pPr>
         <w:numPr>
           <w:ilvl w:val="0"/>
           <w:numId w:val="8"/>
@@ -1139,6 +1276,7 @@
           <w:sz w:val="24"/>
           <w:szCs w:val="24"/>
         </w:rPr>
+        <w:lastRenderedPageBreak/>
         <w:t>Age Correlation:</w:t>
       </w:r>
       <w:r>
@@ -1202,7 +1340,7 @@
                     <pic:cNvPicPr/>
                   </pic:nvPicPr>
                   <pic:blipFill>
-                    <a:blip r:embed="rId7"/>
+                    <a:blip r:embed="rId8"/>
                     <a:stretch>
                       <a:fillRect/>
                     </a:stretch>
@@ -1235,7 +1373,6 @@
           <w:sz w:val="24"/>
           <w:szCs w:val="24"/>
         </w:rPr>
-        <w:lastRenderedPageBreak/>
         <w:t xml:space="preserve">Gender Distribution: The dataset contains a relatively balanced split between male and female patients, though there is a slightly higher frequency of males. A very small fraction of records </w:t>
       </w:r>
       <w:proofErr w:type="gramStart"/>
@@ -1294,7 +1431,7 @@
                     <pic:cNvPicPr/>
                   </pic:nvPicPr>
                   <pic:blipFill>
-                    <a:blip r:embed="rId8"/>
+                    <a:blip r:embed="rId9"/>
                     <a:stretch>
                       <a:fillRect/>
                     </a:stretch>
@@ -1333,6 +1470,7 @@
           <w:sz w:val="24"/>
           <w:szCs w:val="24"/>
         </w:rPr>
+        <w:lastRenderedPageBreak/>
         <w:t>Localization:</w:t>
       </w:r>
       <w:r>
@@ -1392,9 +1530,9 @@
           <w:szCs w:val="24"/>
         </w:rPr>
         <w:drawing>
-          <wp:inline distT="0" distB="0" distL="0" distR="0" wp14:anchorId="505271E0" wp14:editId="673BF399">
-            <wp:extent cx="5465099" cy="3786824"/>
-            <wp:effectExtent l="0" t="0" r="2540" b="4445"/>
+          <wp:inline distT="0" distB="0" distL="0" distR="0" wp14:anchorId="505271E0" wp14:editId="5A7B01C8">
+            <wp:extent cx="4823460" cy="3342225"/>
+            <wp:effectExtent l="0" t="0" r="0" b="0"/>
             <wp:docPr id="1673766392" name="Picture 1"/>
             <wp:cNvGraphicFramePr>
               <a:graphicFrameLocks xmlns:a="http://schemas.openxmlformats.org/drawingml/2006/main" noChangeAspect="1"/>
@@ -1407,7 +1545,7 @@
                     <pic:cNvPicPr/>
                   </pic:nvPicPr>
                   <pic:blipFill>
-                    <a:blip r:embed="rId9"/>
+                    <a:blip r:embed="rId10"/>
                     <a:stretch>
                       <a:fillRect/>
                     </a:stretch>
@@ -1415,7 +1553,7 @@
                   <pic:spPr>
                     <a:xfrm>
                       <a:off x="0" y="0"/>
-                      <a:ext cx="5483019" cy="3799241"/>
+                      <a:ext cx="4853503" cy="3363042"/>
                     </a:xfrm>
                     <a:prstGeom prst="rect">
                       <a:avLst/>
@@ -1430,52 +1568,73 @@
     </w:p>
     <w:p>
       <w:pPr>
+        <w:pStyle w:val="ListParagraph"/>
+        <w:numPr>
+          <w:ilvl w:val="0"/>
+          <w:numId w:val="16"/>
+        </w:numPr>
+        <w:rPr>
+          <w:sz w:val="24"/>
+          <w:szCs w:val="24"/>
+        </w:rPr>
+      </w:pPr>
+      <w:r>
+        <w:rPr>
+          <w:b/>
+          <w:bCs/>
+          <w:sz w:val="24"/>
+          <w:szCs w:val="24"/>
+        </w:rPr>
+        <w:t>Age vs. Disease Type:</w:t>
+      </w:r>
+      <w:r>
+        <w:rPr>
+          <w:sz w:val="24"/>
+          <w:szCs w:val="24"/>
+        </w:rPr>
+        <w:t xml:space="preserve"> The boxplot reveals a critical clinical trend: conditions like Basal Cell Carcinoma (bcc) and Actinic Keratoses (</w:t>
+      </w:r>
+      <w:proofErr w:type="spellStart"/>
+      <w:r>
+        <w:rPr>
+          <w:sz w:val="24"/>
+          <w:szCs w:val="24"/>
+        </w:rPr>
+        <w:t>akiec</w:t>
+      </w:r>
+      <w:proofErr w:type="spellEnd"/>
+      <w:r>
+        <w:rPr>
+          <w:sz w:val="24"/>
+          <w:szCs w:val="24"/>
+        </w:rPr>
+        <w:t>) are predominantly found in older patients (typically 60+ years). In contrast, common benign moles like Melanocytic Nevi (</w:t>
+      </w:r>
+      <w:proofErr w:type="spellStart"/>
+      <w:r>
+        <w:rPr>
+          <w:sz w:val="24"/>
+          <w:szCs w:val="24"/>
+        </w:rPr>
+        <w:t>nv</w:t>
+      </w:r>
+      <w:proofErr w:type="spellEnd"/>
+      <w:r>
+        <w:rPr>
+          <w:sz w:val="24"/>
+          <w:szCs w:val="24"/>
+        </w:rPr>
+        <w:t>) span a much wider and significantly younger age range.</w:t>
+      </w:r>
+    </w:p>
+    <w:p>
+      <w:pPr>
         <w:ind w:left="720"/>
         <w:rPr>
           <w:sz w:val="24"/>
           <w:szCs w:val="24"/>
         </w:rPr>
       </w:pPr>
-      <w:r>
-        <w:rPr>
-          <w:sz w:val="24"/>
-          <w:szCs w:val="24"/>
-        </w:rPr>
-        <w:lastRenderedPageBreak/>
-        <w:t>Age vs. Disease Type: The boxplot reveals a critical clinical trend: conditions like Basal Cell Carcinoma (bcc) and Actinic Keratoses (</w:t>
-      </w:r>
-      <w:proofErr w:type="spellStart"/>
-      <w:r>
-        <w:rPr>
-          <w:sz w:val="24"/>
-          <w:szCs w:val="24"/>
-        </w:rPr>
-        <w:t>akiec</w:t>
-      </w:r>
-      <w:proofErr w:type="spellEnd"/>
-      <w:r>
-        <w:rPr>
-          <w:sz w:val="24"/>
-          <w:szCs w:val="24"/>
-        </w:rPr>
-        <w:t>) are predominantly found in older patients (typically 60+ years). In contrast, common benign moles like Melanocytic Nevi (</w:t>
-      </w:r>
-      <w:proofErr w:type="spellStart"/>
-      <w:r>
-        <w:rPr>
-          <w:sz w:val="24"/>
-          <w:szCs w:val="24"/>
-        </w:rPr>
-        <w:t>nv</w:t>
-      </w:r>
-      <w:proofErr w:type="spellEnd"/>
-      <w:r>
-        <w:rPr>
-          <w:sz w:val="24"/>
-          <w:szCs w:val="24"/>
-        </w:rPr>
-        <w:t>) span a much wider and significantly younger age range.</w:t>
-      </w:r>
     </w:p>
     <w:p>
       <w:pPr>
@@ -1485,15 +1644,6 @@
           <w:szCs w:val="24"/>
         </w:rPr>
       </w:pPr>
-    </w:p>
-    <w:p>
-      <w:pPr>
-        <w:ind w:left="720"/>
-        <w:rPr>
-          <w:sz w:val="24"/>
-          <w:szCs w:val="24"/>
-        </w:rPr>
-      </w:pPr>
       <w:r>
         <w:rPr>
           <w:noProof/>
@@ -1501,9 +1651,9 @@
           <w:szCs w:val="24"/>
         </w:rPr>
         <w:drawing>
-          <wp:inline distT="0" distB="0" distL="0" distR="0" wp14:anchorId="3C025A56" wp14:editId="6BFC7B65">
-            <wp:extent cx="5767191" cy="4617720"/>
-            <wp:effectExtent l="0" t="0" r="5080" b="0"/>
+          <wp:inline distT="0" distB="0" distL="0" distR="0" wp14:anchorId="3C025A56" wp14:editId="57D121C5">
+            <wp:extent cx="5196840" cy="4161047"/>
+            <wp:effectExtent l="0" t="0" r="3810" b="0"/>
             <wp:docPr id="1532525476" name="Picture 1"/>
             <wp:cNvGraphicFramePr>
               <a:graphicFrameLocks xmlns:a="http://schemas.openxmlformats.org/drawingml/2006/main" noChangeAspect="1"/>
@@ -1516,7 +1666,7 @@
                     <pic:cNvPicPr/>
                   </pic:nvPicPr>
                   <pic:blipFill>
-                    <a:blip r:embed="rId10"/>
+                    <a:blip r:embed="rId11"/>
                     <a:stretch>
                       <a:fillRect/>
                     </a:stretch>
@@ -1524,7 +1674,7 @@
                   <pic:spPr>
                     <a:xfrm>
                       <a:off x="0" y="0"/>
-                      <a:ext cx="5769750" cy="4619769"/>
+                      <a:ext cx="5201956" cy="4165144"/>
                     </a:xfrm>
                     <a:prstGeom prst="rect">
                       <a:avLst/>
@@ -1539,15 +1689,6 @@
     </w:p>
     <w:p>
       <w:pPr>
-        <w:ind w:left="720"/>
-        <w:rPr>
-          <w:sz w:val="24"/>
-          <w:szCs w:val="24"/>
-        </w:rPr>
-      </w:pPr>
-    </w:p>
-    <w:p>
-      <w:pPr>
         <w:rPr>
           <w:b/>
           <w:bCs/>
@@ -1572,6 +1713,7 @@
           <w:sz w:val="28"/>
           <w:szCs w:val="28"/>
         </w:rPr>
+        <w:lastRenderedPageBreak/>
         <w:t xml:space="preserve"> Data Preprocessing and its EDA Output</w:t>
       </w:r>
     </w:p>
@@ -1607,11 +1749,10 @@
           <w:sz w:val="24"/>
           <w:szCs w:val="24"/>
         </w:rPr>
-        <w:lastRenderedPageBreak/>
         <w:drawing>
-          <wp:inline distT="0" distB="0" distL="0" distR="0" wp14:anchorId="03B3B0DE" wp14:editId="1C9E63E0">
-            <wp:extent cx="5486400" cy="3571979"/>
-            <wp:effectExtent l="0" t="0" r="0" b="9525"/>
+          <wp:inline distT="0" distB="0" distL="0" distR="0" wp14:anchorId="03B3B0DE" wp14:editId="309D6D2B">
+            <wp:extent cx="5349240" cy="3482679"/>
+            <wp:effectExtent l="0" t="0" r="3810" b="3810"/>
             <wp:docPr id="107339137" name="Picture 1"/>
             <wp:cNvGraphicFramePr>
               <a:graphicFrameLocks xmlns:a="http://schemas.openxmlformats.org/drawingml/2006/main" noChangeAspect="1"/>
@@ -1624,7 +1765,7 @@
                     <pic:cNvPicPr/>
                   </pic:nvPicPr>
                   <pic:blipFill>
-                    <a:blip r:embed="rId11"/>
+                    <a:blip r:embed="rId12"/>
                     <a:stretch>
                       <a:fillRect/>
                     </a:stretch>
@@ -1632,7 +1773,7 @@
                   <pic:spPr>
                     <a:xfrm>
                       <a:off x="0" y="0"/>
-                      <a:ext cx="5496779" cy="3578736"/>
+                      <a:ext cx="5362057" cy="3491024"/>
                     </a:xfrm>
                     <a:prstGeom prst="rect">
                       <a:avLst/>
@@ -1663,9 +1804,9 @@
           <w:szCs w:val="24"/>
         </w:rPr>
         <w:drawing>
-          <wp:inline distT="0" distB="0" distL="0" distR="0" wp14:anchorId="3DE81322" wp14:editId="0B32C6FD">
-            <wp:extent cx="5623560" cy="4853047"/>
-            <wp:effectExtent l="0" t="0" r="0" b="5080"/>
+          <wp:inline distT="0" distB="0" distL="0" distR="0" wp14:anchorId="3DE81322" wp14:editId="33FA39FA">
+            <wp:extent cx="5440680" cy="4695224"/>
+            <wp:effectExtent l="0" t="0" r="7620" b="0"/>
             <wp:docPr id="508962457" name="Picture 1"/>
             <wp:cNvGraphicFramePr>
               <a:graphicFrameLocks xmlns:a="http://schemas.openxmlformats.org/drawingml/2006/main" noChangeAspect="1"/>
@@ -1678,7 +1819,7 @@
                     <pic:cNvPicPr/>
                   </pic:nvPicPr>
                   <pic:blipFill>
-                    <a:blip r:embed="rId12"/>
+                    <a:blip r:embed="rId13"/>
                     <a:stretch>
                       <a:fillRect/>
                     </a:stretch>
@@ -1686,7 +1827,7 @@
                   <pic:spPr>
                     <a:xfrm>
                       <a:off x="0" y="0"/>
-                      <a:ext cx="5627542" cy="4856483"/>
+                      <a:ext cx="5447776" cy="4701348"/>
                     </a:xfrm>
                     <a:prstGeom prst="rect">
                       <a:avLst/>
@@ -1704,59 +1845,37 @@
         <w:rPr>
           <w:b/>
           <w:bCs/>
-          <w:sz w:val="24"/>
-          <w:szCs w:val="24"/>
-        </w:rPr>
-      </w:pPr>
-    </w:p>
-    <w:p>
-      <w:pPr>
-        <w:rPr>
-          <w:b/>
-          <w:bCs/>
-          <w:sz w:val="24"/>
-          <w:szCs w:val="24"/>
-        </w:rPr>
-      </w:pPr>
-    </w:p>
-    <w:p>
-      <w:pPr>
-        <w:rPr>
-          <w:b/>
-          <w:bCs/>
-          <w:sz w:val="24"/>
-          <w:szCs w:val="24"/>
-        </w:rPr>
-      </w:pPr>
-    </w:p>
-    <w:p>
-      <w:pPr>
-        <w:rPr>
-          <w:b/>
-          <w:bCs/>
-          <w:sz w:val="24"/>
-          <w:szCs w:val="24"/>
-        </w:rPr>
-      </w:pPr>
-    </w:p>
-    <w:p>
-      <w:pPr>
-        <w:rPr>
-          <w:b/>
-          <w:bCs/>
-          <w:sz w:val="28"/>
-          <w:szCs w:val="28"/>
-        </w:rPr>
-      </w:pPr>
-      <w:r>
-        <w:rPr>
-          <w:b/>
-          <w:bCs/>
-          <w:sz w:val="28"/>
-          <w:szCs w:val="28"/>
+          <w:sz w:val="32"/>
+          <w:szCs w:val="32"/>
+        </w:rPr>
+      </w:pPr>
+      <w:r>
+        <w:rPr>
+          <w:b/>
+          <w:bCs/>
+          <w:sz w:val="32"/>
+          <w:szCs w:val="32"/>
         </w:rPr>
         <w:lastRenderedPageBreak/>
-        <w:t xml:space="preserve">MODEL ACCURACY OF BASIC PREDICTION MODELS, BEFORE FEATURE EXTRACTION </w:t>
+        <w:t>MODEL ACCURACY OF BASIC PREDICTION MODELS</w:t>
+      </w:r>
+      <w:r>
+        <w:rPr>
+          <w:b/>
+          <w:bCs/>
+          <w:sz w:val="32"/>
+          <w:szCs w:val="32"/>
+        </w:rPr>
+        <w:t xml:space="preserve">: </w:t>
+      </w:r>
+      <w:r>
+        <w:rPr>
+          <w:b/>
+          <w:bCs/>
+          <w:sz w:val="32"/>
+          <w:szCs w:val="32"/>
+        </w:rPr>
+        <w:t xml:space="preserve"> BEFORE FEATURE EXTRACTION </w:t>
       </w:r>
     </w:p>
     <w:p>
@@ -1792,7 +1911,7 @@
                     <pic:cNvPicPr/>
                   </pic:nvPicPr>
                   <pic:blipFill>
-                    <a:blip r:embed="rId13"/>
+                    <a:blip r:embed="rId14"/>
                     <a:stretch>
                       <a:fillRect/>
                     </a:stretch>
@@ -1818,26 +1937,26 @@
         <w:rPr>
           <w:b/>
           <w:bCs/>
-          <w:sz w:val="24"/>
-          <w:szCs w:val="24"/>
-        </w:rPr>
-      </w:pPr>
-    </w:p>
-    <w:p>
-      <w:pPr>
-        <w:rPr>
-          <w:b/>
-          <w:bCs/>
           <w:sz w:val="28"/>
           <w:szCs w:val="28"/>
         </w:rPr>
       </w:pPr>
-      <w:r>
-        <w:rPr>
-          <w:b/>
-          <w:bCs/>
-          <w:sz w:val="28"/>
-          <w:szCs w:val="28"/>
+    </w:p>
+    <w:p>
+      <w:pPr>
+        <w:rPr>
+          <w:b/>
+          <w:bCs/>
+          <w:sz w:val="32"/>
+          <w:szCs w:val="32"/>
+        </w:rPr>
+      </w:pPr>
+      <w:r>
+        <w:rPr>
+          <w:b/>
+          <w:bCs/>
+          <w:sz w:val="32"/>
+          <w:szCs w:val="32"/>
         </w:rPr>
         <w:t>CONFUSION MATRIX FOR THE BEST ONE: RANDOM FOREST</w:t>
       </w:r>
@@ -1875,7 +1994,7 @@
                     <pic:cNvPicPr/>
                   </pic:nvPicPr>
                   <pic:blipFill>
-                    <a:blip r:embed="rId14"/>
+                    <a:blip r:embed="rId15"/>
                     <a:stretch>
                       <a:fillRect/>
                     </a:stretch>
@@ -1901,16 +2020,16 @@
         <w:rPr>
           <w:b/>
           <w:bCs/>
-          <w:sz w:val="28"/>
-          <w:szCs w:val="28"/>
-        </w:rPr>
-      </w:pPr>
-      <w:r>
-        <w:rPr>
-          <w:b/>
-          <w:bCs/>
-          <w:sz w:val="28"/>
-          <w:szCs w:val="28"/>
+          <w:sz w:val="36"/>
+          <w:szCs w:val="36"/>
+        </w:rPr>
+      </w:pPr>
+      <w:r>
+        <w:rPr>
+          <w:b/>
+          <w:bCs/>
+          <w:sz w:val="36"/>
+          <w:szCs w:val="36"/>
         </w:rPr>
         <w:lastRenderedPageBreak/>
         <w:t>Preprocessing Steps</w:t>
@@ -2140,7 +2259,7 @@
                     <pic:cNvPicPr/>
                   </pic:nvPicPr>
                   <pic:blipFill>
-                    <a:blip r:embed="rId15"/>
+                    <a:blip r:embed="rId16"/>
                     <a:stretch>
                       <a:fillRect/>
                     </a:stretch>
@@ -2207,15 +2326,6 @@
     </w:p>
     <w:p>
       <w:pPr>
-        <w:ind w:left="720"/>
-        <w:rPr>
-          <w:sz w:val="24"/>
-          <w:szCs w:val="24"/>
-        </w:rPr>
-      </w:pPr>
-    </w:p>
-    <w:p>
-      <w:pPr>
         <w:rPr>
           <w:b/>
           <w:bCs/>
@@ -2335,7 +2445,7 @@
                     <pic:cNvPicPr/>
                   </pic:nvPicPr>
                   <pic:blipFill>
-                    <a:blip r:embed="rId16"/>
+                    <a:blip r:embed="rId17"/>
                     <a:stretch>
                       <a:fillRect/>
                     </a:stretch>
@@ -2358,19 +2468,28 @@
     </w:p>
     <w:p>
       <w:pPr>
-        <w:rPr>
-          <w:b/>
-          <w:bCs/>
-          <w:sz w:val="28"/>
-          <w:szCs w:val="28"/>
-        </w:rPr>
-      </w:pPr>
-      <w:r>
-        <w:rPr>
-          <w:b/>
-          <w:bCs/>
-          <w:sz w:val="28"/>
-          <w:szCs w:val="28"/>
+        <w:ind w:left="720"/>
+        <w:rPr>
+          <w:sz w:val="24"/>
+          <w:szCs w:val="24"/>
+        </w:rPr>
+      </w:pPr>
+    </w:p>
+    <w:p>
+      <w:pPr>
+        <w:rPr>
+          <w:b/>
+          <w:bCs/>
+          <w:sz w:val="36"/>
+          <w:szCs w:val="36"/>
+        </w:rPr>
+      </w:pPr>
+      <w:r>
+        <w:rPr>
+          <w:b/>
+          <w:bCs/>
+          <w:sz w:val="36"/>
+          <w:szCs w:val="36"/>
         </w:rPr>
         <w:lastRenderedPageBreak/>
         <w:t>AFTER HYBRID FEATURE ENGINEERING:</w:t>
@@ -2406,7 +2525,7 @@
                     <pic:cNvPicPr/>
                   </pic:nvPicPr>
                   <pic:blipFill>
-                    <a:blip r:embed="rId17"/>
+                    <a:blip r:embed="rId18"/>
                     <a:stretch>
                       <a:fillRect/>
                     </a:stretch>
@@ -2466,7 +2585,7 @@
                     <pic:cNvPicPr/>
                   </pic:nvPicPr>
                   <pic:blipFill>
-                    <a:blip r:embed="rId18"/>
+                    <a:blip r:embed="rId19"/>
                     <a:stretch>
                       <a:fillRect/>
                     </a:stretch>
@@ -2517,7 +2636,7 @@
                     <pic:cNvPicPr/>
                   </pic:nvPicPr>
                   <pic:blipFill>
-                    <a:blip r:embed="rId19"/>
+                    <a:blip r:embed="rId20"/>
                     <a:stretch>
                       <a:fillRect/>
                     </a:stretch>
@@ -2541,24 +2660,36 @@
     <w:p>
       <w:pPr>
         <w:rPr>
-          <w:sz w:val="24"/>
-          <w:szCs w:val="24"/>
-        </w:rPr>
-      </w:pPr>
-      <w:r>
-        <w:rPr>
-          <w:sz w:val="24"/>
-          <w:szCs w:val="24"/>
-        </w:rPr>
-        <w:t># STAGE 3: HYPERPARAMETER VALIDATION</w:t>
-      </w:r>
-      <w:r>
-        <w:rPr>
-          <w:sz w:val="24"/>
-          <w:szCs w:val="24"/>
+          <w:b/>
+          <w:bCs/>
+          <w:sz w:val="24"/>
+          <w:szCs w:val="24"/>
+        </w:rPr>
+      </w:pPr>
+      <w:r>
+        <w:rPr>
+          <w:b/>
+          <w:bCs/>
+          <w:sz w:val="36"/>
+          <w:szCs w:val="36"/>
+        </w:rPr>
+        <w:t>STAGE 3: HYPERPARAMETER VALIDATION</w:t>
+      </w:r>
+      <w:r>
+        <w:rPr>
+          <w:b/>
+          <w:bCs/>
+          <w:sz w:val="36"/>
+          <w:szCs w:val="36"/>
         </w:rPr>
         <w:br/>
-        <w:t># Even though accuracy remained stable, this step confirms that</w:t>
+      </w:r>
+      <w:r>
+        <w:rPr>
+          <w:sz w:val="24"/>
+          <w:szCs w:val="24"/>
+        </w:rPr>
+        <w:t xml:space="preserve"> Even though accuracy remained stable, this step confirms that</w:t>
       </w:r>
       <w:r>
         <w:rPr>
@@ -2566,23 +2697,7 @@
           <w:szCs w:val="24"/>
         </w:rPr>
         <w:br/>
-        <w:t xml:space="preserve"># our Stage 2 features are </w:t>
-      </w:r>
-      <w:proofErr w:type="gramStart"/>
-      <w:r>
-        <w:rPr>
-          <w:sz w:val="24"/>
-          <w:szCs w:val="24"/>
-        </w:rPr>
-        <w:t>robust</w:t>
-      </w:r>
-      <w:proofErr w:type="gramEnd"/>
-      <w:r>
-        <w:rPr>
-          <w:sz w:val="24"/>
-          <w:szCs w:val="24"/>
-        </w:rPr>
-        <w:t xml:space="preserve"> and the model is not overfitting.</w:t>
+        <w:t>our Stage 2 features are robust and the model is not overfitting.</w:t>
       </w:r>
       <w:r>
         <w:rPr>
@@ -2590,7 +2705,15 @@
           <w:szCs w:val="24"/>
         </w:rPr>
         <w:br/>
-        <w:t># Final Optimized Accuracy: 76.46%</w:t>
+      </w:r>
+      <w:r>
+        <w:rPr>
+          <w:b/>
+          <w:bCs/>
+          <w:sz w:val="24"/>
+          <w:szCs w:val="24"/>
+        </w:rPr>
+        <w:t>Final Optimized Accuracy: 76.46%</w:t>
       </w:r>
     </w:p>
     <w:p>
@@ -2874,6 +2997,68 @@
     <w:p>
       <w:pPr>
         <w:rPr>
+          <w:sz w:val="24"/>
+          <w:szCs w:val="24"/>
+        </w:rPr>
+      </w:pPr>
+      <w:r>
+        <w:rPr>
+          <w:noProof/>
+        </w:rPr>
+        <w:lastRenderedPageBreak/>
+        <w:drawing>
+          <wp:inline distT="0" distB="0" distL="0" distR="0" wp14:anchorId="3BBCCD34" wp14:editId="28183FB1">
+            <wp:extent cx="6645910" cy="3856355"/>
+            <wp:effectExtent l="0" t="0" r="2540" b="0"/>
+            <wp:docPr id="1482410410" name="Picture 1"/>
+            <wp:cNvGraphicFramePr>
+              <a:graphicFrameLocks xmlns:a="http://schemas.openxmlformats.org/drawingml/2006/main" noChangeAspect="1"/>
+            </wp:cNvGraphicFramePr>
+            <a:graphic xmlns:a="http://schemas.openxmlformats.org/drawingml/2006/main">
+              <a:graphicData uri="http://schemas.openxmlformats.org/drawingml/2006/picture">
+                <pic:pic xmlns:pic="http://schemas.openxmlformats.org/drawingml/2006/picture">
+                  <pic:nvPicPr>
+                    <pic:cNvPr id="0" name="Picture 1"/>
+                    <pic:cNvPicPr>
+                      <a:picLocks noChangeAspect="1" noChangeArrowheads="1"/>
+                    </pic:cNvPicPr>
+                  </pic:nvPicPr>
+                  <pic:blipFill>
+                    <a:blip r:embed="rId21">
+                      <a:extLst>
+                        <a:ext uri="{28A0092B-C50C-407E-A947-70E740481C1C}">
+                          <a14:useLocalDpi xmlns:a14="http://schemas.microsoft.com/office/drawing/2010/main" val="0"/>
+                        </a:ext>
+                      </a:extLst>
+                    </a:blip>
+                    <a:srcRect/>
+                    <a:stretch>
+                      <a:fillRect/>
+                    </a:stretch>
+                  </pic:blipFill>
+                  <pic:spPr bwMode="auto">
+                    <a:xfrm>
+                      <a:off x="0" y="0"/>
+                      <a:ext cx="6645910" cy="3856355"/>
+                    </a:xfrm>
+                    <a:prstGeom prst="rect">
+                      <a:avLst/>
+                    </a:prstGeom>
+                    <a:noFill/>
+                    <a:ln>
+                      <a:noFill/>
+                    </a:ln>
+                  </pic:spPr>
+                </pic:pic>
+              </a:graphicData>
+            </a:graphic>
+          </wp:inline>
+        </w:drawing>
+      </w:r>
+    </w:p>
+    <w:p>
+      <w:pPr>
+        <w:rPr>
           <w:b/>
           <w:bCs/>
           <w:sz w:val="24"/>
@@ -2902,23 +3087,7 @@
           <w:sz w:val="24"/>
           <w:szCs w:val="24"/>
         </w:rPr>
-        <w:t xml:space="preserve">The final model provides a </w:t>
-      </w:r>
-      <w:proofErr w:type="gramStart"/>
-      <w:r>
-        <w:rPr>
-          <w:sz w:val="24"/>
-          <w:szCs w:val="24"/>
-        </w:rPr>
-        <w:t>dual-score</w:t>
-      </w:r>
-      <w:proofErr w:type="gramEnd"/>
-      <w:r>
-        <w:rPr>
-          <w:sz w:val="24"/>
-          <w:szCs w:val="24"/>
-        </w:rPr>
-        <w:t xml:space="preserve"> for every image. Instead of a single "Melanoma" label, the output is:</w:t>
+        <w:t>The final model provides a dual-score for every image. Instead of a single "Melanoma" label, the output is:</w:t>
       </w:r>
     </w:p>
     <w:tbl>
@@ -3245,7 +3414,6 @@
           <w:sz w:val="24"/>
           <w:szCs w:val="24"/>
         </w:rPr>
-        <w:lastRenderedPageBreak/>
         <w:t>Final System Performance:</w:t>
       </w:r>
     </w:p>
@@ -3360,18 +3528,10 @@
     <w:p>
       <w:pPr>
         <w:rPr>
-          <w:sz w:val="24"/>
-          <w:szCs w:val="24"/>
-        </w:rPr>
-      </w:pPr>
-    </w:p>
-    <w:p>
-      <w:pPr>
-        <w:rPr>
-          <w:b/>
-          <w:bCs/>
-          <w:sz w:val="24"/>
-          <w:szCs w:val="24"/>
+          <w:b/>
+          <w:bCs/>
+          <w:sz w:val="40"/>
+          <w:szCs w:val="40"/>
           <w:lang w:val="en-US"/>
         </w:rPr>
       </w:pPr>
@@ -3379,8 +3539,8 @@
         <w:rPr>
           <w:b/>
           <w:bCs/>
-          <w:sz w:val="24"/>
-          <w:szCs w:val="24"/>
+          <w:sz w:val="40"/>
+          <w:szCs w:val="40"/>
           <w:lang w:val="en-US"/>
         </w:rPr>
         <w:t>Comparison Analysis</w:t>
@@ -3417,6 +3577,7 @@
           <w:szCs w:val="24"/>
           <w:lang w:val="en-US"/>
         </w:rPr>
+        <w:lastRenderedPageBreak/>
         <w:t xml:space="preserve">The Bipolar Fuzzy CNN built on MobileNetV2 further improved the system by learning hierarchical image features directly from data while also modeling diagnostic uncertainty through membership and non-membership scores. Compared to the classical ML pipeline, this approach is better suited for skin lesion classification because many classes in HAM10000 have strong visual overlap. </w:t>
       </w:r>
     </w:p>
@@ -3899,14 +4060,36 @@
           <w:lang w:val="en-US"/>
         </w:rPr>
       </w:pPr>
-      <w:r>
-        <w:rPr>
-          <w:b/>
-          <w:bCs/>
-          <w:sz w:val="24"/>
-          <w:szCs w:val="24"/>
+    </w:p>
+    <w:p>
+      <w:pPr>
+        <w:rPr>
+          <w:b/>
+          <w:bCs/>
+          <w:sz w:val="32"/>
+          <w:szCs w:val="32"/>
           <w:lang w:val="en-US"/>
         </w:rPr>
+      </w:pPr>
+    </w:p>
+    <w:p>
+      <w:pPr>
+        <w:rPr>
+          <w:b/>
+          <w:bCs/>
+          <w:sz w:val="32"/>
+          <w:szCs w:val="32"/>
+          <w:lang w:val="en-US"/>
+        </w:rPr>
+      </w:pPr>
+      <w:r>
+        <w:rPr>
+          <w:b/>
+          <w:bCs/>
+          <w:sz w:val="32"/>
+          <w:szCs w:val="32"/>
+          <w:lang w:val="en-US"/>
+        </w:rPr>
         <w:t>What the comparison shows</w:t>
       </w:r>
     </w:p>
@@ -3926,6 +4109,24 @@
         </w:rPr>
         <w:t xml:space="preserve">The comparison makes three things clear. First, raw-image machine learning gives the weakest result because it cannot capture complex visual patterns well. Second, feature engineering significantly boosts performance by turning images into more informative descriptors. Third, deep learning with bipolar fuzzy logic gives the best overall result because it combines strong visual learning with uncertainty handling, which is important in medical diagnosis. </w:t>
       </w:r>
+    </w:p>
+    <w:p>
+      <w:pPr>
+        <w:rPr>
+          <w:sz w:val="24"/>
+          <w:szCs w:val="24"/>
+          <w:lang w:val="en-US"/>
+        </w:rPr>
+      </w:pPr>
+    </w:p>
+    <w:p>
+      <w:pPr>
+        <w:rPr>
+          <w:sz w:val="24"/>
+          <w:szCs w:val="24"/>
+          <w:lang w:val="en-US"/>
+        </w:rPr>
+      </w:pPr>
     </w:p>
     <w:p>
       <w:pPr>
@@ -4217,7 +4418,6 @@
                 <w:szCs w:val="24"/>
                 <w:lang w:val="en-US"/>
               </w:rPr>
-              <w:lastRenderedPageBreak/>
               <w:t>PCA to 50 components</w:t>
             </w:r>
           </w:p>
@@ -4288,6 +4488,2342 @@
     </w:p>
     <w:p>
       <w:pPr>
+        <w:rPr>
+          <w:sz w:val="24"/>
+          <w:szCs w:val="24"/>
+          <w:lang w:val="en-US"/>
+        </w:rPr>
+      </w:pPr>
+    </w:p>
+    <w:p>
+      <w:pPr>
+        <w:rPr>
+          <w:sz w:val="24"/>
+          <w:szCs w:val="24"/>
+          <w:lang w:val="en-US"/>
+        </w:rPr>
+      </w:pPr>
+    </w:p>
+    <w:p>
+      <w:pPr>
+        <w:rPr>
+          <w:sz w:val="24"/>
+          <w:szCs w:val="24"/>
+          <w:lang w:val="en-US"/>
+        </w:rPr>
+      </w:pPr>
+    </w:p>
+    <w:p>
+      <w:pPr>
+        <w:rPr>
+          <w:b/>
+          <w:bCs/>
+          <w:sz w:val="32"/>
+          <w:szCs w:val="32"/>
+          <w:lang w:val="en-US"/>
+        </w:rPr>
+      </w:pPr>
+      <w:r>
+        <w:rPr>
+          <w:b/>
+          <w:bCs/>
+          <w:sz w:val="32"/>
+          <w:szCs w:val="32"/>
+          <w:lang w:val="en-US"/>
+        </w:rPr>
+        <w:lastRenderedPageBreak/>
+        <w:t xml:space="preserve">FURTHER </w:t>
+      </w:r>
+      <w:proofErr w:type="gramStart"/>
+      <w:r>
+        <w:rPr>
+          <w:b/>
+          <w:bCs/>
+          <w:sz w:val="32"/>
+          <w:szCs w:val="32"/>
+          <w:lang w:val="en-US"/>
+        </w:rPr>
+        <w:t>EARLY STAGE</w:t>
+      </w:r>
+      <w:proofErr w:type="gramEnd"/>
+      <w:r>
+        <w:rPr>
+          <w:b/>
+          <w:bCs/>
+          <w:sz w:val="32"/>
+          <w:szCs w:val="32"/>
+          <w:lang w:val="en-US"/>
+        </w:rPr>
+        <w:t xml:space="preserve"> CLASSIFICATION:</w:t>
+      </w:r>
+    </w:p>
+    <w:p>
+      <w:pPr>
+        <w:rPr>
+          <w:sz w:val="24"/>
+          <w:szCs w:val="24"/>
+        </w:rPr>
+      </w:pPr>
+      <w:r>
+        <w:rPr>
+          <w:b/>
+          <w:bCs/>
+          <w:sz w:val="24"/>
+          <w:szCs w:val="24"/>
+        </w:rPr>
+        <w:t xml:space="preserve">Melanoma Stage Classification: </w:t>
+      </w:r>
+      <w:r>
+        <w:rPr>
+          <w:sz w:val="24"/>
+          <w:szCs w:val="24"/>
+        </w:rPr>
+        <w:t>This model focuses specifically on melanoma lesions and aims to classify them into distinct stages based on age.</w:t>
+      </w:r>
+    </w:p>
+    <w:p>
+      <w:pPr>
+        <w:rPr>
+          <w:b/>
+          <w:bCs/>
+          <w:sz w:val="24"/>
+          <w:szCs w:val="24"/>
+        </w:rPr>
+      </w:pPr>
+      <w:r>
+        <w:rPr>
+          <w:b/>
+          <w:bCs/>
+          <w:sz w:val="24"/>
+          <w:szCs w:val="24"/>
+        </w:rPr>
+        <w:t> How We Classified Melanoma Stages</w:t>
+      </w:r>
+    </w:p>
+    <w:p>
+      <w:pPr>
+        <w:rPr>
+          <w:sz w:val="24"/>
+          <w:szCs w:val="24"/>
+        </w:rPr>
+      </w:pPr>
+      <w:r>
+        <w:rPr>
+          <w:sz w:val="24"/>
+          <w:szCs w:val="24"/>
+        </w:rPr>
+        <w:t>For the melanoma stage classification, we went through several steps to build and refine our model:</w:t>
+      </w:r>
+    </w:p>
+    <w:p>
+      <w:pPr>
+        <w:numPr>
+          <w:ilvl w:val="0"/>
+          <w:numId w:val="18"/>
+        </w:numPr>
+        <w:rPr>
+          <w:sz w:val="24"/>
+          <w:szCs w:val="24"/>
+        </w:rPr>
+      </w:pPr>
+      <w:r>
+        <w:rPr>
+          <w:b/>
+          <w:bCs/>
+          <w:sz w:val="24"/>
+          <w:szCs w:val="24"/>
+        </w:rPr>
+        <w:t>Preparing the Data:</w:t>
+      </w:r>
+      <w:r>
+        <w:rPr>
+          <w:sz w:val="24"/>
+          <w:szCs w:val="24"/>
+        </w:rPr>
+        <w:t xml:space="preserve"> We started by taking all melanoma-related entries from our main dataset. Since the original data didn't have 'stages', we created our own based on patient age: 'Low/Early' for younger patients, 'Intermediate' for middle-aged, and 'High/Advanced' for older patients. We also made sure to handle any missing age information.</w:t>
+      </w:r>
+    </w:p>
+    <w:p>
+      <w:pPr>
+        <w:numPr>
+          <w:ilvl w:val="0"/>
+          <w:numId w:val="18"/>
+        </w:numPr>
+        <w:rPr>
+          <w:sz w:val="24"/>
+          <w:szCs w:val="24"/>
+        </w:rPr>
+      </w:pPr>
+      <w:r>
+        <w:rPr>
+          <w:b/>
+          <w:bCs/>
+          <w:sz w:val="24"/>
+          <w:szCs w:val="24"/>
+        </w:rPr>
+        <w:t>Loading and Resizing Images:</w:t>
+      </w:r>
+      <w:r>
+        <w:rPr>
+          <w:sz w:val="24"/>
+          <w:szCs w:val="24"/>
+        </w:rPr>
+        <w:t xml:space="preserve"> We then collected all the images associated with these melanoma cases. Each image was resized to a standard size (128x128 pixels) and normalized so that pixel values were between 0 and 1, which helps the model learn better. These images were paired with their newly assigned stages.</w:t>
+      </w:r>
+    </w:p>
+    <w:p>
+      <w:pPr>
+        <w:numPr>
+          <w:ilvl w:val="0"/>
+          <w:numId w:val="18"/>
+        </w:numPr>
+        <w:rPr>
+          <w:sz w:val="24"/>
+          <w:szCs w:val="24"/>
+        </w:rPr>
+      </w:pPr>
+      <w:r>
+        <w:rPr>
+          <w:b/>
+          <w:bCs/>
+          <w:sz w:val="24"/>
+          <w:szCs w:val="24"/>
+        </w:rPr>
+        <w:t>Splitting for Training and Testing:</w:t>
+      </w:r>
+      <w:r>
+        <w:rPr>
+          <w:sz w:val="24"/>
+          <w:szCs w:val="24"/>
+        </w:rPr>
+        <w:t xml:space="preserve"> We divided our prepared data into two parts: a larger portion for training the model and a smaller portion for testing how well it performs on unseen images. This split was done carefully to ensure all stages were represented fairly in both sets.</w:t>
+      </w:r>
+    </w:p>
+    <w:p>
+      <w:pPr>
+        <w:numPr>
+          <w:ilvl w:val="0"/>
+          <w:numId w:val="18"/>
+        </w:numPr>
+        <w:rPr>
+          <w:sz w:val="24"/>
+          <w:szCs w:val="24"/>
+        </w:rPr>
+      </w:pPr>
+      <w:r>
+        <w:rPr>
+          <w:b/>
+          <w:bCs/>
+          <w:sz w:val="24"/>
+          <w:szCs w:val="24"/>
+        </w:rPr>
+        <w:t>Building the Model (Transfer Learning):</w:t>
+      </w:r>
+      <w:r>
+        <w:rPr>
+          <w:sz w:val="24"/>
+          <w:szCs w:val="24"/>
+        </w:rPr>
+        <w:t xml:space="preserve"> We used a powerful pre-trained model called MobileNetV2 as a starting point. This model has already learned a lot about recognizing features in images. Initially, we 'froze' its core layers so they wouldn't change, and we added our own custom layers on top to adapt it for our specific three-stage classification task.</w:t>
+      </w:r>
+    </w:p>
+    <w:p>
+      <w:pPr>
+        <w:numPr>
+          <w:ilvl w:val="0"/>
+          <w:numId w:val="18"/>
+        </w:numPr>
+        <w:rPr>
+          <w:sz w:val="24"/>
+          <w:szCs w:val="24"/>
+        </w:rPr>
+      </w:pPr>
+      <w:r>
+        <w:rPr>
+          <w:b/>
+          <w:bCs/>
+          <w:sz w:val="24"/>
+          <w:szCs w:val="24"/>
+        </w:rPr>
+        <w:t>Initial Training:</w:t>
+      </w:r>
+      <w:r>
+        <w:rPr>
+          <w:sz w:val="24"/>
+          <w:szCs w:val="24"/>
+        </w:rPr>
+        <w:t xml:space="preserve"> We then trained this initial version of our model. During this phase, the custom layers learned to classify the melanoma stages, while the frozen MobileNetV2 layers provided robust image features.</w:t>
+      </w:r>
+    </w:p>
+    <w:p>
+      <w:pPr>
+        <w:numPr>
+          <w:ilvl w:val="0"/>
+          <w:numId w:val="18"/>
+        </w:numPr>
+        <w:rPr>
+          <w:sz w:val="24"/>
+          <w:szCs w:val="24"/>
+        </w:rPr>
+      </w:pPr>
+      <w:r>
+        <w:rPr>
+          <w:b/>
+          <w:bCs/>
+          <w:sz w:val="24"/>
+          <w:szCs w:val="24"/>
+        </w:rPr>
+        <w:t>Fine-tuning for Better Performance:</w:t>
+      </w:r>
+      <w:r>
+        <w:rPr>
+          <w:sz w:val="24"/>
+          <w:szCs w:val="24"/>
+        </w:rPr>
+        <w:t xml:space="preserve"> After the initial training, we 'unfroze' some of the deeper layers of MobileNetV2. This allowed the model to fine-tune its image recognition abilities specifically for our skin lesion images, leading to more accurate predictions.</w:t>
+      </w:r>
+    </w:p>
+    <w:p>
+      <w:pPr>
+        <w:numPr>
+          <w:ilvl w:val="0"/>
+          <w:numId w:val="18"/>
+        </w:numPr>
+        <w:rPr>
+          <w:sz w:val="24"/>
+          <w:szCs w:val="24"/>
+        </w:rPr>
+      </w:pPr>
+      <w:r>
+        <w:rPr>
+          <w:b/>
+          <w:bCs/>
+          <w:sz w:val="24"/>
+          <w:szCs w:val="24"/>
+        </w:rPr>
+        <w:t>Augmenting Data for Robustness:</w:t>
+      </w:r>
+      <w:r>
+        <w:rPr>
+          <w:sz w:val="24"/>
+          <w:szCs w:val="24"/>
+        </w:rPr>
+        <w:t xml:space="preserve"> To make our model even more robust and prevent it from memorizing the training images, we used a technique called data augmentation. This involved creating slightly altered versions of our training images (like rotating or zooming them) on the fly, effectively increasing our training data.</w:t>
+      </w:r>
+    </w:p>
+    <w:p>
+      <w:pPr>
+        <w:numPr>
+          <w:ilvl w:val="0"/>
+          <w:numId w:val="18"/>
+        </w:numPr>
+        <w:rPr>
+          <w:sz w:val="24"/>
+          <w:szCs w:val="24"/>
+        </w:rPr>
+      </w:pPr>
+      <w:r>
+        <w:rPr>
+          <w:b/>
+          <w:bCs/>
+          <w:sz w:val="24"/>
+          <w:szCs w:val="24"/>
+        </w:rPr>
+        <w:t>Evaluating the Final Model:</w:t>
+      </w:r>
+      <w:r>
+        <w:rPr>
+          <w:sz w:val="24"/>
+          <w:szCs w:val="24"/>
+        </w:rPr>
+        <w:t xml:space="preserve"> Finally, we evaluated the performance of our fine-tuned model using metrics like precision, recall, and F1-score for each melanoma stage to understand its strengths and weaknesses.</w:t>
+      </w:r>
+    </w:p>
+    <w:p>
+      <w:pPr>
+        <w:ind w:left="360"/>
+        <w:rPr>
+          <w:b/>
+          <w:bCs/>
+          <w:sz w:val="24"/>
+          <w:szCs w:val="24"/>
+        </w:rPr>
+      </w:pPr>
+    </w:p>
+    <w:p>
+      <w:pPr>
+        <w:ind w:left="360"/>
+        <w:rPr>
+          <w:b/>
+          <w:bCs/>
+          <w:sz w:val="24"/>
+          <w:szCs w:val="24"/>
+        </w:rPr>
+      </w:pPr>
+    </w:p>
+    <w:p>
+      <w:pPr>
+        <w:ind w:left="360"/>
+        <w:rPr>
+          <w:b/>
+          <w:bCs/>
+          <w:sz w:val="24"/>
+          <w:szCs w:val="24"/>
+        </w:rPr>
+      </w:pPr>
+    </w:p>
+    <w:p>
+      <w:pPr>
+        <w:ind w:left="360"/>
+        <w:rPr>
+          <w:b/>
+          <w:bCs/>
+          <w:sz w:val="24"/>
+          <w:szCs w:val="24"/>
+        </w:rPr>
+      </w:pPr>
+    </w:p>
+    <w:p>
+      <w:pPr>
+        <w:ind w:left="360"/>
+        <w:rPr>
+          <w:b/>
+          <w:bCs/>
+          <w:sz w:val="24"/>
+          <w:szCs w:val="24"/>
+        </w:rPr>
+      </w:pPr>
+    </w:p>
+    <w:p>
+      <w:pPr>
+        <w:ind w:left="360"/>
+        <w:rPr>
+          <w:b/>
+          <w:bCs/>
+          <w:sz w:val="24"/>
+          <w:szCs w:val="24"/>
+        </w:rPr>
+      </w:pPr>
+    </w:p>
+    <w:p>
+      <w:pPr>
+        <w:rPr>
+          <w:b/>
+          <w:bCs/>
+          <w:sz w:val="36"/>
+          <w:szCs w:val="36"/>
+        </w:rPr>
+      </w:pPr>
+      <w:r>
+        <w:rPr>
+          <w:b/>
+          <w:bCs/>
+          <w:sz w:val="36"/>
+          <w:szCs w:val="36"/>
+        </w:rPr>
+        <w:lastRenderedPageBreak/>
+        <w:t>Visualizing and Comparing Our Models</w:t>
+      </w:r>
+    </w:p>
+    <w:p>
+      <w:pPr>
+        <w:rPr>
+          <w:b/>
+          <w:bCs/>
+          <w:sz w:val="36"/>
+          <w:szCs w:val="36"/>
+        </w:rPr>
+      </w:pPr>
+      <w:r>
+        <w:rPr>
+          <w:b/>
+          <w:bCs/>
+          <w:sz w:val="36"/>
+          <w:szCs w:val="36"/>
+        </w:rPr>
+        <w:drawing>
+          <wp:inline distT="0" distB="0" distL="0" distR="0" wp14:anchorId="05A7E015" wp14:editId="4D2CC5D6">
+            <wp:extent cx="4739640" cy="4497359"/>
+            <wp:effectExtent l="0" t="0" r="3810" b="0"/>
+            <wp:docPr id="798017490" name="Picture 1"/>
+            <wp:cNvGraphicFramePr>
+              <a:graphicFrameLocks xmlns:a="http://schemas.openxmlformats.org/drawingml/2006/main" noChangeAspect="1"/>
+            </wp:cNvGraphicFramePr>
+            <a:graphic xmlns:a="http://schemas.openxmlformats.org/drawingml/2006/main">
+              <a:graphicData uri="http://schemas.openxmlformats.org/drawingml/2006/picture">
+                <pic:pic xmlns:pic="http://schemas.openxmlformats.org/drawingml/2006/picture">
+                  <pic:nvPicPr>
+                    <pic:cNvPr id="798017490" name=""/>
+                    <pic:cNvPicPr/>
+                  </pic:nvPicPr>
+                  <pic:blipFill>
+                    <a:blip r:embed="rId22"/>
+                    <a:stretch>
+                      <a:fillRect/>
+                    </a:stretch>
+                  </pic:blipFill>
+                  <pic:spPr>
+                    <a:xfrm>
+                      <a:off x="0" y="0"/>
+                      <a:ext cx="4750334" cy="4507507"/>
+                    </a:xfrm>
+                    <a:prstGeom prst="rect">
+                      <a:avLst/>
+                    </a:prstGeom>
+                  </pic:spPr>
+                </pic:pic>
+              </a:graphicData>
+            </a:graphic>
+          </wp:inline>
+        </w:drawing>
+      </w:r>
+    </w:p>
+    <w:p>
+      <w:pPr>
+        <w:ind w:left="360"/>
+        <w:rPr>
+          <w:sz w:val="24"/>
+          <w:szCs w:val="24"/>
+        </w:rPr>
+      </w:pPr>
+    </w:p>
+    <w:p>
+      <w:pPr>
+        <w:rPr>
+          <w:b/>
+          <w:bCs/>
+          <w:sz w:val="24"/>
+          <w:szCs w:val="24"/>
+        </w:rPr>
+      </w:pPr>
+      <w:r>
+        <w:rPr>
+          <w:b/>
+          <w:bCs/>
+          <w:sz w:val="24"/>
+          <w:szCs w:val="24"/>
+        </w:rPr>
+        <w:drawing>
+          <wp:inline distT="0" distB="0" distL="0" distR="0" wp14:anchorId="11844BAD" wp14:editId="5191F02A">
+            <wp:extent cx="4800600" cy="4057989"/>
+            <wp:effectExtent l="0" t="0" r="0" b="0"/>
+            <wp:docPr id="879014857" name="Picture 1"/>
+            <wp:cNvGraphicFramePr>
+              <a:graphicFrameLocks xmlns:a="http://schemas.openxmlformats.org/drawingml/2006/main" noChangeAspect="1"/>
+            </wp:cNvGraphicFramePr>
+            <a:graphic xmlns:a="http://schemas.openxmlformats.org/drawingml/2006/main">
+              <a:graphicData uri="http://schemas.openxmlformats.org/drawingml/2006/picture">
+                <pic:pic xmlns:pic="http://schemas.openxmlformats.org/drawingml/2006/picture">
+                  <pic:nvPicPr>
+                    <pic:cNvPr id="879014857" name=""/>
+                    <pic:cNvPicPr/>
+                  </pic:nvPicPr>
+                  <pic:blipFill>
+                    <a:blip r:embed="rId23"/>
+                    <a:stretch>
+                      <a:fillRect/>
+                    </a:stretch>
+                  </pic:blipFill>
+                  <pic:spPr>
+                    <a:xfrm>
+                      <a:off x="0" y="0"/>
+                      <a:ext cx="4808288" cy="4064488"/>
+                    </a:xfrm>
+                    <a:prstGeom prst="rect">
+                      <a:avLst/>
+                    </a:prstGeom>
+                  </pic:spPr>
+                </pic:pic>
+              </a:graphicData>
+            </a:graphic>
+          </wp:inline>
+        </w:drawing>
+      </w:r>
+    </w:p>
+    <w:p>
+      <w:pPr>
+        <w:rPr>
+          <w:b/>
+          <w:bCs/>
+          <w:sz w:val="24"/>
+          <w:szCs w:val="24"/>
+          <w:lang w:val="en-US"/>
+        </w:rPr>
+      </w:pPr>
+    </w:p>
+    <w:p>
+      <w:pPr>
+        <w:rPr>
+          <w:sz w:val="24"/>
+          <w:szCs w:val="24"/>
+          <w:lang w:val="en-US"/>
+        </w:rPr>
+      </w:pPr>
+      <w:r>
+        <w:rPr>
+          <w:sz w:val="24"/>
+          <w:szCs w:val="24"/>
+          <w:lang w:val="en-US"/>
+        </w:rPr>
+        <w:lastRenderedPageBreak/>
+        <w:drawing>
+          <wp:inline distT="0" distB="0" distL="0" distR="0" wp14:anchorId="735E55A5" wp14:editId="34E72E84">
+            <wp:extent cx="5791200" cy="4388497"/>
+            <wp:effectExtent l="0" t="0" r="0" b="0"/>
+            <wp:docPr id="271504268" name="Picture 1"/>
+            <wp:cNvGraphicFramePr>
+              <a:graphicFrameLocks xmlns:a="http://schemas.openxmlformats.org/drawingml/2006/main" noChangeAspect="1"/>
+            </wp:cNvGraphicFramePr>
+            <a:graphic xmlns:a="http://schemas.openxmlformats.org/drawingml/2006/main">
+              <a:graphicData uri="http://schemas.openxmlformats.org/drawingml/2006/picture">
+                <pic:pic xmlns:pic="http://schemas.openxmlformats.org/drawingml/2006/picture">
+                  <pic:nvPicPr>
+                    <pic:cNvPr id="271504268" name=""/>
+                    <pic:cNvPicPr/>
+                  </pic:nvPicPr>
+                  <pic:blipFill>
+                    <a:blip r:embed="rId24"/>
+                    <a:stretch>
+                      <a:fillRect/>
+                    </a:stretch>
+                  </pic:blipFill>
+                  <pic:spPr>
+                    <a:xfrm>
+                      <a:off x="0" y="0"/>
+                      <a:ext cx="5794846" cy="4391260"/>
+                    </a:xfrm>
+                    <a:prstGeom prst="rect">
+                      <a:avLst/>
+                    </a:prstGeom>
+                  </pic:spPr>
+                </pic:pic>
+              </a:graphicData>
+            </a:graphic>
+          </wp:inline>
+        </w:drawing>
+      </w:r>
+    </w:p>
+    <w:p>
+      <w:pPr>
+        <w:rPr>
+          <w:sz w:val="24"/>
+          <w:szCs w:val="24"/>
+          <w:lang w:val="en-US"/>
+        </w:rPr>
+      </w:pPr>
+    </w:p>
+    <w:p>
+      <w:pPr>
+        <w:rPr>
+          <w:b/>
+          <w:bCs/>
+          <w:sz w:val="24"/>
+          <w:szCs w:val="24"/>
+        </w:rPr>
+      </w:pPr>
+      <w:r>
+        <w:rPr>
+          <w:b/>
+          <w:bCs/>
+          <w:sz w:val="24"/>
+          <w:szCs w:val="24"/>
+        </w:rPr>
+        <w:t>Model Comparison: Melanoma Stage Classification vs. Bipolar Fuzzy Set Classification</w:t>
+      </w:r>
+    </w:p>
+    <w:tbl>
+      <w:tblPr>
+        <w:tblW w:w="0" w:type="auto"/>
+        <w:tblInd w:w="120" w:type="dxa"/>
+        <w:shd w:val="clear" w:color="auto" w:fill="282A2C"/>
+        <w:tblCellMar>
+          <w:top w:w="15" w:type="dxa"/>
+          <w:left w:w="15" w:type="dxa"/>
+          <w:bottom w:w="15" w:type="dxa"/>
+          <w:right w:w="15" w:type="dxa"/>
+        </w:tblCellMar>
+        <w:tblLook w:val="04A0" w:firstRow="1" w:lastRow="0" w:firstColumn="1" w:lastColumn="0" w:noHBand="0" w:noVBand="1"/>
+      </w:tblPr>
+      <w:tblGrid>
+        <w:gridCol w:w="2012"/>
+        <w:gridCol w:w="3122"/>
+        <w:gridCol w:w="5212"/>
+      </w:tblGrid>
+      <w:tr>
+        <w:trPr>
+          <w:tblHeader/>
+        </w:trPr>
+        <w:tc>
+          <w:tcPr>
+            <w:tcW w:w="0" w:type="auto"/>
+            <w:tcBorders>
+              <w:top w:val="nil"/>
+              <w:left w:val="nil"/>
+              <w:bottom w:val="nil"/>
+              <w:right w:val="nil"/>
+            </w:tcBorders>
+            <w:shd w:val="clear" w:color="auto" w:fill="282A2C"/>
+            <w:noWrap/>
+            <w:tcMar>
+              <w:top w:w="120" w:type="dxa"/>
+              <w:left w:w="120" w:type="dxa"/>
+              <w:bottom w:w="120" w:type="dxa"/>
+              <w:right w:w="120" w:type="dxa"/>
+            </w:tcMar>
+            <w:vAlign w:val="center"/>
+            <w:hideMark/>
+          </w:tcPr>
+          <w:p>
+            <w:pPr>
+              <w:rPr>
+                <w:b/>
+                <w:bCs/>
+                <w:sz w:val="24"/>
+                <w:szCs w:val="24"/>
+              </w:rPr>
+            </w:pPr>
+            <w:r>
+              <w:rPr>
+                <w:b/>
+                <w:bCs/>
+                <w:sz w:val="24"/>
+                <w:szCs w:val="24"/>
+              </w:rPr>
+              <w:t>Feature</w:t>
+            </w:r>
+          </w:p>
+        </w:tc>
+        <w:tc>
+          <w:tcPr>
+            <w:tcW w:w="0" w:type="auto"/>
+            <w:tcBorders>
+              <w:top w:val="nil"/>
+              <w:left w:val="nil"/>
+              <w:bottom w:val="nil"/>
+              <w:right w:val="nil"/>
+            </w:tcBorders>
+            <w:shd w:val="clear" w:color="auto" w:fill="282A2C"/>
+            <w:noWrap/>
+            <w:tcMar>
+              <w:top w:w="120" w:type="dxa"/>
+              <w:left w:w="120" w:type="dxa"/>
+              <w:bottom w:w="120" w:type="dxa"/>
+              <w:right w:w="120" w:type="dxa"/>
+            </w:tcMar>
+            <w:vAlign w:val="center"/>
+            <w:hideMark/>
+          </w:tcPr>
+          <w:p>
+            <w:pPr>
+              <w:rPr>
+                <w:b/>
+                <w:bCs/>
+                <w:sz w:val="24"/>
+                <w:szCs w:val="24"/>
+              </w:rPr>
+            </w:pPr>
+            <w:r>
+              <w:rPr>
+                <w:b/>
+                <w:bCs/>
+                <w:sz w:val="24"/>
+                <w:szCs w:val="24"/>
+              </w:rPr>
+              <w:t>Melanoma Stage Classification</w:t>
+            </w:r>
+          </w:p>
+        </w:tc>
+        <w:tc>
+          <w:tcPr>
+            <w:tcW w:w="0" w:type="auto"/>
+            <w:tcBorders>
+              <w:top w:val="nil"/>
+              <w:left w:val="nil"/>
+              <w:bottom w:val="nil"/>
+              <w:right w:val="nil"/>
+            </w:tcBorders>
+            <w:shd w:val="clear" w:color="auto" w:fill="282A2C"/>
+            <w:noWrap/>
+            <w:tcMar>
+              <w:top w:w="120" w:type="dxa"/>
+              <w:left w:w="120" w:type="dxa"/>
+              <w:bottom w:w="120" w:type="dxa"/>
+              <w:right w:w="120" w:type="dxa"/>
+            </w:tcMar>
+            <w:vAlign w:val="center"/>
+            <w:hideMark/>
+          </w:tcPr>
+          <w:p>
+            <w:pPr>
+              <w:rPr>
+                <w:b/>
+                <w:bCs/>
+                <w:sz w:val="24"/>
+                <w:szCs w:val="24"/>
+              </w:rPr>
+            </w:pPr>
+            <w:r>
+              <w:rPr>
+                <w:b/>
+                <w:bCs/>
+                <w:sz w:val="24"/>
+                <w:szCs w:val="24"/>
+              </w:rPr>
+              <w:t>Bipolar Fuzzy Set Classification</w:t>
+            </w:r>
+          </w:p>
+        </w:tc>
+      </w:tr>
+      <w:tr>
+        <w:tc>
+          <w:tcPr>
+            <w:tcW w:w="0" w:type="auto"/>
+            <w:tcBorders>
+              <w:top w:val="nil"/>
+              <w:left w:val="nil"/>
+              <w:bottom w:val="nil"/>
+              <w:right w:val="nil"/>
+            </w:tcBorders>
+            <w:shd w:val="clear" w:color="auto" w:fill="282A2C"/>
+            <w:noWrap/>
+            <w:tcMar>
+              <w:top w:w="120" w:type="dxa"/>
+              <w:left w:w="120" w:type="dxa"/>
+              <w:bottom w:w="120" w:type="dxa"/>
+              <w:right w:w="120" w:type="dxa"/>
+            </w:tcMar>
+            <w:vAlign w:val="center"/>
+            <w:hideMark/>
+          </w:tcPr>
+          <w:p>
+            <w:pPr>
+              <w:rPr>
+                <w:sz w:val="24"/>
+                <w:szCs w:val="24"/>
+              </w:rPr>
+            </w:pPr>
+            <w:r>
+              <w:rPr>
+                <w:b/>
+                <w:bCs/>
+                <w:sz w:val="24"/>
+                <w:szCs w:val="24"/>
+              </w:rPr>
+              <w:t>Target</w:t>
+            </w:r>
+          </w:p>
+        </w:tc>
+        <w:tc>
+          <w:tcPr>
+            <w:tcW w:w="0" w:type="auto"/>
+            <w:tcBorders>
+              <w:top w:val="nil"/>
+              <w:left w:val="nil"/>
+              <w:bottom w:val="nil"/>
+              <w:right w:val="nil"/>
+            </w:tcBorders>
+            <w:shd w:val="clear" w:color="auto" w:fill="282A2C"/>
+            <w:noWrap/>
+            <w:tcMar>
+              <w:top w:w="120" w:type="dxa"/>
+              <w:left w:w="120" w:type="dxa"/>
+              <w:bottom w:w="120" w:type="dxa"/>
+              <w:right w:w="120" w:type="dxa"/>
+            </w:tcMar>
+            <w:vAlign w:val="center"/>
+            <w:hideMark/>
+          </w:tcPr>
+          <w:p>
+            <w:pPr>
+              <w:rPr>
+                <w:sz w:val="24"/>
+                <w:szCs w:val="24"/>
+              </w:rPr>
+            </w:pPr>
+            <w:r>
+              <w:rPr>
+                <w:sz w:val="24"/>
+                <w:szCs w:val="24"/>
+              </w:rPr>
+              <w:t>3 melanoma pseudo-stages (age-based)</w:t>
+            </w:r>
+          </w:p>
+        </w:tc>
+        <w:tc>
+          <w:tcPr>
+            <w:tcW w:w="0" w:type="auto"/>
+            <w:tcBorders>
+              <w:top w:val="nil"/>
+              <w:left w:val="nil"/>
+              <w:bottom w:val="nil"/>
+              <w:right w:val="nil"/>
+            </w:tcBorders>
+            <w:shd w:val="clear" w:color="auto" w:fill="282A2C"/>
+            <w:noWrap/>
+            <w:tcMar>
+              <w:top w:w="120" w:type="dxa"/>
+              <w:left w:w="120" w:type="dxa"/>
+              <w:bottom w:w="120" w:type="dxa"/>
+              <w:right w:w="120" w:type="dxa"/>
+            </w:tcMar>
+            <w:vAlign w:val="center"/>
+            <w:hideMark/>
+          </w:tcPr>
+          <w:p>
+            <w:pPr>
+              <w:rPr>
+                <w:sz w:val="24"/>
+                <w:szCs w:val="24"/>
+              </w:rPr>
+            </w:pPr>
+            <w:r>
+              <w:rPr>
+                <w:sz w:val="24"/>
+                <w:szCs w:val="24"/>
+              </w:rPr>
+              <w:t>7 general skin lesion types</w:t>
+            </w:r>
+          </w:p>
+        </w:tc>
+      </w:tr>
+      <w:tr>
+        <w:tc>
+          <w:tcPr>
+            <w:tcW w:w="0" w:type="auto"/>
+            <w:tcBorders>
+              <w:top w:val="nil"/>
+              <w:left w:val="nil"/>
+              <w:bottom w:val="nil"/>
+              <w:right w:val="nil"/>
+            </w:tcBorders>
+            <w:shd w:val="clear" w:color="auto" w:fill="282A2C"/>
+            <w:noWrap/>
+            <w:tcMar>
+              <w:top w:w="120" w:type="dxa"/>
+              <w:left w:w="120" w:type="dxa"/>
+              <w:bottom w:w="120" w:type="dxa"/>
+              <w:right w:w="120" w:type="dxa"/>
+            </w:tcMar>
+            <w:vAlign w:val="center"/>
+            <w:hideMark/>
+          </w:tcPr>
+          <w:p>
+            <w:pPr>
+              <w:rPr>
+                <w:sz w:val="24"/>
+                <w:szCs w:val="24"/>
+              </w:rPr>
+            </w:pPr>
+            <w:r>
+              <w:rPr>
+                <w:b/>
+                <w:bCs/>
+                <w:sz w:val="24"/>
+                <w:szCs w:val="24"/>
+              </w:rPr>
+              <w:t>Core Idea</w:t>
+            </w:r>
+          </w:p>
+        </w:tc>
+        <w:tc>
+          <w:tcPr>
+            <w:tcW w:w="0" w:type="auto"/>
+            <w:tcBorders>
+              <w:top w:val="nil"/>
+              <w:left w:val="nil"/>
+              <w:bottom w:val="nil"/>
+              <w:right w:val="nil"/>
+            </w:tcBorders>
+            <w:shd w:val="clear" w:color="auto" w:fill="282A2C"/>
+            <w:noWrap/>
+            <w:tcMar>
+              <w:top w:w="120" w:type="dxa"/>
+              <w:left w:w="120" w:type="dxa"/>
+              <w:bottom w:w="120" w:type="dxa"/>
+              <w:right w:w="120" w:type="dxa"/>
+            </w:tcMar>
+            <w:vAlign w:val="center"/>
+            <w:hideMark/>
+          </w:tcPr>
+          <w:p>
+            <w:pPr>
+              <w:rPr>
+                <w:sz w:val="24"/>
+                <w:szCs w:val="24"/>
+              </w:rPr>
+            </w:pPr>
+            <w:r>
+              <w:rPr>
+                <w:sz w:val="24"/>
+                <w:szCs w:val="24"/>
+              </w:rPr>
+              <w:t>Standard multi-class classification</w:t>
+            </w:r>
+          </w:p>
+        </w:tc>
+        <w:tc>
+          <w:tcPr>
+            <w:tcW w:w="0" w:type="auto"/>
+            <w:tcBorders>
+              <w:top w:val="nil"/>
+              <w:left w:val="nil"/>
+              <w:bottom w:val="nil"/>
+              <w:right w:val="nil"/>
+            </w:tcBorders>
+            <w:shd w:val="clear" w:color="auto" w:fill="282A2C"/>
+            <w:noWrap/>
+            <w:tcMar>
+              <w:top w:w="120" w:type="dxa"/>
+              <w:left w:w="120" w:type="dxa"/>
+              <w:bottom w:w="120" w:type="dxa"/>
+              <w:right w:w="120" w:type="dxa"/>
+            </w:tcMar>
+            <w:vAlign w:val="center"/>
+            <w:hideMark/>
+          </w:tcPr>
+          <w:p>
+            <w:pPr>
+              <w:rPr>
+                <w:sz w:val="24"/>
+                <w:szCs w:val="24"/>
+              </w:rPr>
+            </w:pPr>
+            <w:r>
+              <w:rPr>
+                <w:sz w:val="24"/>
+                <w:szCs w:val="24"/>
+              </w:rPr>
+              <w:t>Handles uncertainty &amp; inter-class similarity</w:t>
+            </w:r>
+          </w:p>
+        </w:tc>
+      </w:tr>
+      <w:tr>
+        <w:tc>
+          <w:tcPr>
+            <w:tcW w:w="0" w:type="auto"/>
+            <w:tcBorders>
+              <w:top w:val="nil"/>
+              <w:left w:val="nil"/>
+              <w:bottom w:val="nil"/>
+              <w:right w:val="nil"/>
+            </w:tcBorders>
+            <w:shd w:val="clear" w:color="auto" w:fill="282A2C"/>
+            <w:noWrap/>
+            <w:tcMar>
+              <w:top w:w="120" w:type="dxa"/>
+              <w:left w:w="120" w:type="dxa"/>
+              <w:bottom w:w="120" w:type="dxa"/>
+              <w:right w:w="120" w:type="dxa"/>
+            </w:tcMar>
+            <w:vAlign w:val="center"/>
+            <w:hideMark/>
+          </w:tcPr>
+          <w:p>
+            <w:pPr>
+              <w:rPr>
+                <w:sz w:val="24"/>
+                <w:szCs w:val="24"/>
+              </w:rPr>
+            </w:pPr>
+            <w:r>
+              <w:rPr>
+                <w:b/>
+                <w:bCs/>
+                <w:sz w:val="24"/>
+                <w:szCs w:val="24"/>
+              </w:rPr>
+              <w:t>Base Model</w:t>
+            </w:r>
+          </w:p>
+        </w:tc>
+        <w:tc>
+          <w:tcPr>
+            <w:tcW w:w="0" w:type="auto"/>
+            <w:tcBorders>
+              <w:top w:val="nil"/>
+              <w:left w:val="nil"/>
+              <w:bottom w:val="nil"/>
+              <w:right w:val="nil"/>
+            </w:tcBorders>
+            <w:shd w:val="clear" w:color="auto" w:fill="282A2C"/>
+            <w:noWrap/>
+            <w:tcMar>
+              <w:top w:w="120" w:type="dxa"/>
+              <w:left w:w="120" w:type="dxa"/>
+              <w:bottom w:w="120" w:type="dxa"/>
+              <w:right w:w="120" w:type="dxa"/>
+            </w:tcMar>
+            <w:vAlign w:val="center"/>
+            <w:hideMark/>
+          </w:tcPr>
+          <w:p>
+            <w:pPr>
+              <w:rPr>
+                <w:sz w:val="24"/>
+                <w:szCs w:val="24"/>
+              </w:rPr>
+            </w:pPr>
+            <w:r>
+              <w:rPr>
+                <w:sz w:val="24"/>
+                <w:szCs w:val="24"/>
+              </w:rPr>
+              <w:t>MobileNetV2 (transfer learning)</w:t>
+            </w:r>
+          </w:p>
+        </w:tc>
+        <w:tc>
+          <w:tcPr>
+            <w:tcW w:w="0" w:type="auto"/>
+            <w:tcBorders>
+              <w:top w:val="nil"/>
+              <w:left w:val="nil"/>
+              <w:bottom w:val="nil"/>
+              <w:right w:val="nil"/>
+            </w:tcBorders>
+            <w:shd w:val="clear" w:color="auto" w:fill="282A2C"/>
+            <w:noWrap/>
+            <w:tcMar>
+              <w:top w:w="120" w:type="dxa"/>
+              <w:left w:w="120" w:type="dxa"/>
+              <w:bottom w:w="120" w:type="dxa"/>
+              <w:right w:w="120" w:type="dxa"/>
+            </w:tcMar>
+            <w:vAlign w:val="center"/>
+            <w:hideMark/>
+          </w:tcPr>
+          <w:p>
+            <w:pPr>
+              <w:rPr>
+                <w:sz w:val="24"/>
+                <w:szCs w:val="24"/>
+              </w:rPr>
+            </w:pPr>
+            <w:r>
+              <w:rPr>
+                <w:sz w:val="24"/>
+                <w:szCs w:val="24"/>
+              </w:rPr>
+              <w:t>MobileNetV2 (transfer learning)</w:t>
+            </w:r>
+          </w:p>
+        </w:tc>
+      </w:tr>
+      <w:tr>
+        <w:tc>
+          <w:tcPr>
+            <w:tcW w:w="0" w:type="auto"/>
+            <w:tcBorders>
+              <w:top w:val="nil"/>
+              <w:left w:val="nil"/>
+              <w:bottom w:val="nil"/>
+              <w:right w:val="nil"/>
+            </w:tcBorders>
+            <w:shd w:val="clear" w:color="auto" w:fill="282A2C"/>
+            <w:noWrap/>
+            <w:tcMar>
+              <w:top w:w="120" w:type="dxa"/>
+              <w:left w:w="120" w:type="dxa"/>
+              <w:bottom w:w="120" w:type="dxa"/>
+              <w:right w:w="120" w:type="dxa"/>
+            </w:tcMar>
+            <w:vAlign w:val="center"/>
+            <w:hideMark/>
+          </w:tcPr>
+          <w:p>
+            <w:pPr>
+              <w:rPr>
+                <w:sz w:val="24"/>
+                <w:szCs w:val="24"/>
+              </w:rPr>
+            </w:pPr>
+            <w:r>
+              <w:rPr>
+                <w:b/>
+                <w:bCs/>
+                <w:sz w:val="24"/>
+                <w:szCs w:val="24"/>
+              </w:rPr>
+              <w:t>Input Image Size</w:t>
+            </w:r>
+          </w:p>
+        </w:tc>
+        <w:tc>
+          <w:tcPr>
+            <w:tcW w:w="0" w:type="auto"/>
+            <w:tcBorders>
+              <w:top w:val="nil"/>
+              <w:left w:val="nil"/>
+              <w:bottom w:val="nil"/>
+              <w:right w:val="nil"/>
+            </w:tcBorders>
+            <w:shd w:val="clear" w:color="auto" w:fill="282A2C"/>
+            <w:noWrap/>
+            <w:tcMar>
+              <w:top w:w="120" w:type="dxa"/>
+              <w:left w:w="120" w:type="dxa"/>
+              <w:bottom w:w="120" w:type="dxa"/>
+              <w:right w:w="120" w:type="dxa"/>
+            </w:tcMar>
+            <w:vAlign w:val="center"/>
+            <w:hideMark/>
+          </w:tcPr>
+          <w:p>
+            <w:pPr>
+              <w:rPr>
+                <w:sz w:val="24"/>
+                <w:szCs w:val="24"/>
+              </w:rPr>
+            </w:pPr>
+            <w:r>
+              <w:rPr>
+                <w:sz w:val="24"/>
+                <w:szCs w:val="24"/>
+              </w:rPr>
+              <w:t>128x128</w:t>
+            </w:r>
+          </w:p>
+        </w:tc>
+        <w:tc>
+          <w:tcPr>
+            <w:tcW w:w="0" w:type="auto"/>
+            <w:tcBorders>
+              <w:top w:val="nil"/>
+              <w:left w:val="nil"/>
+              <w:bottom w:val="nil"/>
+              <w:right w:val="nil"/>
+            </w:tcBorders>
+            <w:shd w:val="clear" w:color="auto" w:fill="282A2C"/>
+            <w:noWrap/>
+            <w:tcMar>
+              <w:top w:w="120" w:type="dxa"/>
+              <w:left w:w="120" w:type="dxa"/>
+              <w:bottom w:w="120" w:type="dxa"/>
+              <w:right w:w="120" w:type="dxa"/>
+            </w:tcMar>
+            <w:vAlign w:val="center"/>
+            <w:hideMark/>
+          </w:tcPr>
+          <w:p>
+            <w:pPr>
+              <w:rPr>
+                <w:sz w:val="24"/>
+                <w:szCs w:val="24"/>
+              </w:rPr>
+            </w:pPr>
+            <w:r>
+              <w:rPr>
+                <w:sz w:val="24"/>
+                <w:szCs w:val="24"/>
+              </w:rPr>
+              <w:t>224x224</w:t>
+            </w:r>
+          </w:p>
+        </w:tc>
+      </w:tr>
+      <w:tr>
+        <w:tc>
+          <w:tcPr>
+            <w:tcW w:w="0" w:type="auto"/>
+            <w:tcBorders>
+              <w:top w:val="nil"/>
+              <w:left w:val="nil"/>
+              <w:bottom w:val="nil"/>
+              <w:right w:val="nil"/>
+            </w:tcBorders>
+            <w:shd w:val="clear" w:color="auto" w:fill="282A2C"/>
+            <w:noWrap/>
+            <w:tcMar>
+              <w:top w:w="120" w:type="dxa"/>
+              <w:left w:w="120" w:type="dxa"/>
+              <w:bottom w:w="120" w:type="dxa"/>
+              <w:right w:w="120" w:type="dxa"/>
+            </w:tcMar>
+            <w:vAlign w:val="center"/>
+            <w:hideMark/>
+          </w:tcPr>
+          <w:p>
+            <w:pPr>
+              <w:rPr>
+                <w:sz w:val="24"/>
+                <w:szCs w:val="24"/>
+              </w:rPr>
+            </w:pPr>
+            <w:r>
+              <w:rPr>
+                <w:b/>
+                <w:bCs/>
+                <w:sz w:val="24"/>
+                <w:szCs w:val="24"/>
+              </w:rPr>
+              <w:t>Loss Function (Primary)</w:t>
+            </w:r>
+          </w:p>
+        </w:tc>
+        <w:tc>
+          <w:tcPr>
+            <w:tcW w:w="0" w:type="auto"/>
+            <w:tcBorders>
+              <w:top w:val="nil"/>
+              <w:left w:val="nil"/>
+              <w:bottom w:val="nil"/>
+              <w:right w:val="nil"/>
+            </w:tcBorders>
+            <w:shd w:val="clear" w:color="auto" w:fill="282A2C"/>
+            <w:noWrap/>
+            <w:tcMar>
+              <w:top w:w="120" w:type="dxa"/>
+              <w:left w:w="120" w:type="dxa"/>
+              <w:bottom w:w="120" w:type="dxa"/>
+              <w:right w:w="120" w:type="dxa"/>
+            </w:tcMar>
+            <w:vAlign w:val="center"/>
+            <w:hideMark/>
+          </w:tcPr>
+          <w:p>
+            <w:pPr>
+              <w:rPr>
+                <w:sz w:val="24"/>
+                <w:szCs w:val="24"/>
+              </w:rPr>
+            </w:pPr>
+            <w:r>
+              <w:rPr>
+                <w:sz w:val="24"/>
+                <w:szCs w:val="24"/>
+              </w:rPr>
+              <w:t xml:space="preserve">Categorical </w:t>
+            </w:r>
+            <w:proofErr w:type="spellStart"/>
+            <w:r>
+              <w:rPr>
+                <w:sz w:val="24"/>
+                <w:szCs w:val="24"/>
+              </w:rPr>
+              <w:t>Crossentropy</w:t>
+            </w:r>
+            <w:proofErr w:type="spellEnd"/>
+          </w:p>
+        </w:tc>
+        <w:tc>
+          <w:tcPr>
+            <w:tcW w:w="0" w:type="auto"/>
+            <w:tcBorders>
+              <w:top w:val="nil"/>
+              <w:left w:val="nil"/>
+              <w:bottom w:val="nil"/>
+              <w:right w:val="nil"/>
+            </w:tcBorders>
+            <w:shd w:val="clear" w:color="auto" w:fill="282A2C"/>
+            <w:noWrap/>
+            <w:tcMar>
+              <w:top w:w="120" w:type="dxa"/>
+              <w:left w:w="120" w:type="dxa"/>
+              <w:bottom w:w="120" w:type="dxa"/>
+              <w:right w:w="120" w:type="dxa"/>
+            </w:tcMar>
+            <w:vAlign w:val="center"/>
+            <w:hideMark/>
+          </w:tcPr>
+          <w:p>
+            <w:pPr>
+              <w:rPr>
+                <w:sz w:val="24"/>
+                <w:szCs w:val="24"/>
+              </w:rPr>
+            </w:pPr>
+            <w:r>
+              <w:rPr>
+                <w:sz w:val="24"/>
+                <w:szCs w:val="24"/>
+              </w:rPr>
+              <w:t xml:space="preserve">Membership: Sakaguchi Loss, Non-membership: Binary </w:t>
+            </w:r>
+            <w:proofErr w:type="spellStart"/>
+            <w:r>
+              <w:rPr>
+                <w:sz w:val="24"/>
+                <w:szCs w:val="24"/>
+              </w:rPr>
+              <w:t>Crossentropy</w:t>
+            </w:r>
+            <w:proofErr w:type="spellEnd"/>
+          </w:p>
+        </w:tc>
+      </w:tr>
+      <w:tr>
+        <w:tc>
+          <w:tcPr>
+            <w:tcW w:w="0" w:type="auto"/>
+            <w:tcBorders>
+              <w:top w:val="nil"/>
+              <w:left w:val="nil"/>
+              <w:bottom w:val="nil"/>
+              <w:right w:val="nil"/>
+            </w:tcBorders>
+            <w:shd w:val="clear" w:color="auto" w:fill="282A2C"/>
+            <w:noWrap/>
+            <w:tcMar>
+              <w:top w:w="120" w:type="dxa"/>
+              <w:left w:w="120" w:type="dxa"/>
+              <w:bottom w:w="120" w:type="dxa"/>
+              <w:right w:w="120" w:type="dxa"/>
+            </w:tcMar>
+            <w:vAlign w:val="center"/>
+            <w:hideMark/>
+          </w:tcPr>
+          <w:p>
+            <w:pPr>
+              <w:rPr>
+                <w:sz w:val="24"/>
+                <w:szCs w:val="24"/>
+              </w:rPr>
+            </w:pPr>
+            <w:r>
+              <w:rPr>
+                <w:b/>
+                <w:bCs/>
+                <w:sz w:val="24"/>
+                <w:szCs w:val="24"/>
+              </w:rPr>
+              <w:t>Key Enhancements</w:t>
+            </w:r>
+          </w:p>
+        </w:tc>
+        <w:tc>
+          <w:tcPr>
+            <w:tcW w:w="0" w:type="auto"/>
+            <w:tcBorders>
+              <w:top w:val="nil"/>
+              <w:left w:val="nil"/>
+              <w:bottom w:val="nil"/>
+              <w:right w:val="nil"/>
+            </w:tcBorders>
+            <w:shd w:val="clear" w:color="auto" w:fill="282A2C"/>
+            <w:noWrap/>
+            <w:tcMar>
+              <w:top w:w="120" w:type="dxa"/>
+              <w:left w:w="120" w:type="dxa"/>
+              <w:bottom w:w="120" w:type="dxa"/>
+              <w:right w:w="120" w:type="dxa"/>
+            </w:tcMar>
+            <w:vAlign w:val="center"/>
+            <w:hideMark/>
+          </w:tcPr>
+          <w:p>
+            <w:pPr>
+              <w:rPr>
+                <w:sz w:val="24"/>
+                <w:szCs w:val="24"/>
+              </w:rPr>
+            </w:pPr>
+            <w:r>
+              <w:rPr>
+                <w:sz w:val="24"/>
+                <w:szCs w:val="24"/>
+              </w:rPr>
+              <w:t>Data Augmentation, Fine-tuning</w:t>
+            </w:r>
+          </w:p>
+        </w:tc>
+        <w:tc>
+          <w:tcPr>
+            <w:tcW w:w="0" w:type="auto"/>
+            <w:tcBorders>
+              <w:top w:val="nil"/>
+              <w:left w:val="nil"/>
+              <w:bottom w:val="nil"/>
+              <w:right w:val="nil"/>
+            </w:tcBorders>
+            <w:shd w:val="clear" w:color="auto" w:fill="282A2C"/>
+            <w:noWrap/>
+            <w:tcMar>
+              <w:top w:w="120" w:type="dxa"/>
+              <w:left w:w="120" w:type="dxa"/>
+              <w:bottom w:w="120" w:type="dxa"/>
+              <w:right w:w="120" w:type="dxa"/>
+            </w:tcMar>
+            <w:vAlign w:val="center"/>
+            <w:hideMark/>
+          </w:tcPr>
+          <w:p>
+            <w:pPr>
+              <w:rPr>
+                <w:sz w:val="24"/>
+                <w:szCs w:val="24"/>
+              </w:rPr>
+            </w:pPr>
+            <w:r>
+              <w:rPr>
+                <w:sz w:val="24"/>
+                <w:szCs w:val="24"/>
+              </w:rPr>
+              <w:t>Bipolar Fuzzy Outputs, Sakaguchi Loss, Fine-tuning</w:t>
+            </w:r>
+          </w:p>
+        </w:tc>
+      </w:tr>
+      <w:tr>
+        <w:tc>
+          <w:tcPr>
+            <w:tcW w:w="0" w:type="auto"/>
+            <w:tcBorders>
+              <w:top w:val="nil"/>
+              <w:left w:val="nil"/>
+              <w:bottom w:val="nil"/>
+              <w:right w:val="nil"/>
+            </w:tcBorders>
+            <w:shd w:val="clear" w:color="auto" w:fill="282A2C"/>
+            <w:noWrap/>
+            <w:tcMar>
+              <w:top w:w="120" w:type="dxa"/>
+              <w:left w:w="120" w:type="dxa"/>
+              <w:bottom w:w="120" w:type="dxa"/>
+              <w:right w:w="120" w:type="dxa"/>
+            </w:tcMar>
+            <w:vAlign w:val="center"/>
+            <w:hideMark/>
+          </w:tcPr>
+          <w:p>
+            <w:pPr>
+              <w:rPr>
+                <w:sz w:val="24"/>
+                <w:szCs w:val="24"/>
+              </w:rPr>
+            </w:pPr>
+            <w:r>
+              <w:rPr>
+                <w:b/>
+                <w:bCs/>
+                <w:sz w:val="24"/>
+                <w:szCs w:val="24"/>
+              </w:rPr>
+              <w:lastRenderedPageBreak/>
+              <w:t>Output</w:t>
+            </w:r>
+          </w:p>
+        </w:tc>
+        <w:tc>
+          <w:tcPr>
+            <w:tcW w:w="0" w:type="auto"/>
+            <w:tcBorders>
+              <w:top w:val="nil"/>
+              <w:left w:val="nil"/>
+              <w:bottom w:val="nil"/>
+              <w:right w:val="nil"/>
+            </w:tcBorders>
+            <w:shd w:val="clear" w:color="auto" w:fill="282A2C"/>
+            <w:noWrap/>
+            <w:tcMar>
+              <w:top w:w="120" w:type="dxa"/>
+              <w:left w:w="120" w:type="dxa"/>
+              <w:bottom w:w="120" w:type="dxa"/>
+              <w:right w:w="120" w:type="dxa"/>
+            </w:tcMar>
+            <w:vAlign w:val="center"/>
+            <w:hideMark/>
+          </w:tcPr>
+          <w:p>
+            <w:pPr>
+              <w:rPr>
+                <w:sz w:val="24"/>
+                <w:szCs w:val="24"/>
+              </w:rPr>
+            </w:pPr>
+            <w:r>
+              <w:rPr>
+                <w:sz w:val="24"/>
+                <w:szCs w:val="24"/>
+              </w:rPr>
+              <w:t>Single probability for each stage</w:t>
+            </w:r>
+          </w:p>
+        </w:tc>
+        <w:tc>
+          <w:tcPr>
+            <w:tcW w:w="0" w:type="auto"/>
+            <w:tcBorders>
+              <w:top w:val="nil"/>
+              <w:left w:val="nil"/>
+              <w:bottom w:val="nil"/>
+              <w:right w:val="nil"/>
+            </w:tcBorders>
+            <w:shd w:val="clear" w:color="auto" w:fill="282A2C"/>
+            <w:noWrap/>
+            <w:tcMar>
+              <w:top w:w="120" w:type="dxa"/>
+              <w:left w:w="120" w:type="dxa"/>
+              <w:bottom w:w="120" w:type="dxa"/>
+              <w:right w:w="120" w:type="dxa"/>
+            </w:tcMar>
+            <w:vAlign w:val="center"/>
+            <w:hideMark/>
+          </w:tcPr>
+          <w:p>
+            <w:pPr>
+              <w:rPr>
+                <w:sz w:val="24"/>
+                <w:szCs w:val="24"/>
+              </w:rPr>
+            </w:pPr>
+            <w:r>
+              <w:rPr>
+                <w:sz w:val="24"/>
+                <w:szCs w:val="24"/>
+              </w:rPr>
+              <w:t xml:space="preserve">Membership &amp; </w:t>
+            </w:r>
+            <w:proofErr w:type="gramStart"/>
+            <w:r>
+              <w:rPr>
+                <w:sz w:val="24"/>
+                <w:szCs w:val="24"/>
+              </w:rPr>
+              <w:t>Non-membership</w:t>
+            </w:r>
+            <w:proofErr w:type="gramEnd"/>
+            <w:r>
+              <w:rPr>
+                <w:sz w:val="24"/>
+                <w:szCs w:val="24"/>
+              </w:rPr>
+              <w:t xml:space="preserve"> scores for each class</w:t>
+            </w:r>
+          </w:p>
+        </w:tc>
+      </w:tr>
+      <w:tr>
+        <w:tc>
+          <w:tcPr>
+            <w:tcW w:w="0" w:type="auto"/>
+            <w:tcBorders>
+              <w:top w:val="nil"/>
+              <w:left w:val="nil"/>
+              <w:bottom w:val="nil"/>
+              <w:right w:val="nil"/>
+            </w:tcBorders>
+            <w:shd w:val="clear" w:color="auto" w:fill="282A2C"/>
+            <w:noWrap/>
+            <w:tcMar>
+              <w:top w:w="120" w:type="dxa"/>
+              <w:left w:w="120" w:type="dxa"/>
+              <w:bottom w:w="120" w:type="dxa"/>
+              <w:right w:w="120" w:type="dxa"/>
+            </w:tcMar>
+            <w:vAlign w:val="center"/>
+            <w:hideMark/>
+          </w:tcPr>
+          <w:p>
+            <w:pPr>
+              <w:rPr>
+                <w:sz w:val="24"/>
+                <w:szCs w:val="24"/>
+              </w:rPr>
+            </w:pPr>
+            <w:r>
+              <w:rPr>
+                <w:b/>
+                <w:bCs/>
+                <w:sz w:val="24"/>
+                <w:szCs w:val="24"/>
+              </w:rPr>
+              <w:t>Accuracy (Approx.)</w:t>
+            </w:r>
+          </w:p>
+        </w:tc>
+        <w:tc>
+          <w:tcPr>
+            <w:tcW w:w="0" w:type="auto"/>
+            <w:tcBorders>
+              <w:top w:val="nil"/>
+              <w:left w:val="nil"/>
+              <w:bottom w:val="nil"/>
+              <w:right w:val="nil"/>
+            </w:tcBorders>
+            <w:shd w:val="clear" w:color="auto" w:fill="282A2C"/>
+            <w:noWrap/>
+            <w:tcMar>
+              <w:top w:w="120" w:type="dxa"/>
+              <w:left w:w="120" w:type="dxa"/>
+              <w:bottom w:w="120" w:type="dxa"/>
+              <w:right w:w="120" w:type="dxa"/>
+            </w:tcMar>
+            <w:vAlign w:val="center"/>
+            <w:hideMark/>
+          </w:tcPr>
+          <w:p>
+            <w:pPr>
+              <w:rPr>
+                <w:sz w:val="24"/>
+                <w:szCs w:val="24"/>
+              </w:rPr>
+            </w:pPr>
+            <w:r>
+              <w:rPr>
+                <w:sz w:val="24"/>
+                <w:szCs w:val="24"/>
+              </w:rPr>
+              <w:t>~60-62% (validation accuracy)</w:t>
+            </w:r>
+          </w:p>
+        </w:tc>
+        <w:tc>
+          <w:tcPr>
+            <w:tcW w:w="0" w:type="auto"/>
+            <w:tcBorders>
+              <w:top w:val="nil"/>
+              <w:left w:val="nil"/>
+              <w:bottom w:val="nil"/>
+              <w:right w:val="nil"/>
+            </w:tcBorders>
+            <w:shd w:val="clear" w:color="auto" w:fill="282A2C"/>
+            <w:noWrap/>
+            <w:tcMar>
+              <w:top w:w="120" w:type="dxa"/>
+              <w:left w:w="120" w:type="dxa"/>
+              <w:bottom w:w="120" w:type="dxa"/>
+              <w:right w:w="120" w:type="dxa"/>
+            </w:tcMar>
+            <w:vAlign w:val="center"/>
+            <w:hideMark/>
+          </w:tcPr>
+          <w:p>
+            <w:pPr>
+              <w:rPr>
+                <w:sz w:val="24"/>
+                <w:szCs w:val="24"/>
+              </w:rPr>
+            </w:pPr>
+            <w:r>
+              <w:rPr>
+                <w:sz w:val="24"/>
+                <w:szCs w:val="24"/>
+              </w:rPr>
+              <w:t>~77.78% (validation membership accuracy)</w:t>
+            </w:r>
+          </w:p>
+        </w:tc>
+      </w:tr>
+      <w:tr>
+        <w:tc>
+          <w:tcPr>
+            <w:tcW w:w="0" w:type="auto"/>
+            <w:tcBorders>
+              <w:top w:val="nil"/>
+              <w:left w:val="nil"/>
+              <w:bottom w:val="nil"/>
+              <w:right w:val="nil"/>
+            </w:tcBorders>
+            <w:shd w:val="clear" w:color="auto" w:fill="282A2C"/>
+            <w:noWrap/>
+            <w:tcMar>
+              <w:top w:w="120" w:type="dxa"/>
+              <w:left w:w="120" w:type="dxa"/>
+              <w:bottom w:w="120" w:type="dxa"/>
+              <w:right w:w="120" w:type="dxa"/>
+            </w:tcMar>
+            <w:vAlign w:val="center"/>
+            <w:hideMark/>
+          </w:tcPr>
+          <w:p>
+            <w:pPr>
+              <w:rPr>
+                <w:sz w:val="24"/>
+                <w:szCs w:val="24"/>
+              </w:rPr>
+            </w:pPr>
+            <w:r>
+              <w:rPr>
+                <w:b/>
+                <w:bCs/>
+                <w:sz w:val="24"/>
+                <w:szCs w:val="24"/>
+              </w:rPr>
+              <w:t>Interpretation</w:t>
+            </w:r>
+          </w:p>
+        </w:tc>
+        <w:tc>
+          <w:tcPr>
+            <w:tcW w:w="0" w:type="auto"/>
+            <w:tcBorders>
+              <w:top w:val="nil"/>
+              <w:left w:val="nil"/>
+              <w:bottom w:val="nil"/>
+              <w:right w:val="nil"/>
+            </w:tcBorders>
+            <w:shd w:val="clear" w:color="auto" w:fill="282A2C"/>
+            <w:noWrap/>
+            <w:tcMar>
+              <w:top w:w="120" w:type="dxa"/>
+              <w:left w:w="120" w:type="dxa"/>
+              <w:bottom w:w="120" w:type="dxa"/>
+              <w:right w:w="120" w:type="dxa"/>
+            </w:tcMar>
+            <w:vAlign w:val="center"/>
+            <w:hideMark/>
+          </w:tcPr>
+          <w:p>
+            <w:pPr>
+              <w:rPr>
+                <w:sz w:val="24"/>
+                <w:szCs w:val="24"/>
+              </w:rPr>
+            </w:pPr>
+            <w:r>
+              <w:rPr>
+                <w:sz w:val="24"/>
+                <w:szCs w:val="24"/>
+              </w:rPr>
+              <w:t>Direct stage prediction</w:t>
+            </w:r>
+          </w:p>
+        </w:tc>
+        <w:tc>
+          <w:tcPr>
+            <w:tcW w:w="0" w:type="auto"/>
+            <w:tcBorders>
+              <w:top w:val="nil"/>
+              <w:left w:val="nil"/>
+              <w:bottom w:val="nil"/>
+              <w:right w:val="nil"/>
+            </w:tcBorders>
+            <w:shd w:val="clear" w:color="auto" w:fill="282A2C"/>
+            <w:noWrap/>
+            <w:tcMar>
+              <w:top w:w="120" w:type="dxa"/>
+              <w:left w:w="120" w:type="dxa"/>
+              <w:bottom w:w="120" w:type="dxa"/>
+              <w:right w:w="120" w:type="dxa"/>
+            </w:tcMar>
+            <w:vAlign w:val="center"/>
+            <w:hideMark/>
+          </w:tcPr>
+          <w:p>
+            <w:pPr>
+              <w:rPr>
+                <w:sz w:val="24"/>
+                <w:szCs w:val="24"/>
+              </w:rPr>
+            </w:pPr>
+            <w:r>
+              <w:rPr>
+                <w:sz w:val="24"/>
+                <w:szCs w:val="24"/>
+              </w:rPr>
+              <w:t>Direct prediction + quantifiable uncertainty</w:t>
+            </w:r>
+          </w:p>
+        </w:tc>
+      </w:tr>
+    </w:tbl>
+    <w:p>
+      <w:pPr>
+        <w:rPr>
+          <w:sz w:val="24"/>
+          <w:szCs w:val="24"/>
+        </w:rPr>
+      </w:pPr>
+    </w:p>
+    <w:p>
+      <w:pPr>
+        <w:rPr>
+          <w:sz w:val="24"/>
+          <w:szCs w:val="24"/>
+        </w:rPr>
+      </w:pPr>
+      <w:r>
+        <w:rPr>
+          <w:sz w:val="24"/>
+          <w:szCs w:val="24"/>
+        </w:rPr>
+        <w:t>This table highlights how the Bipolar Fuzzy Set Classification, with its dual outputs and specialized loss function, offers a more nuanced approach, particularly suited for medical diagnoses where uncertainty and class relationships are vital considerations.</w:t>
+      </w:r>
+    </w:p>
+    <w:p>
+      <w:pPr>
+        <w:rPr>
+          <w:sz w:val="24"/>
+          <w:szCs w:val="24"/>
+        </w:rPr>
+      </w:pPr>
+    </w:p>
+    <w:p>
+      <w:pPr>
+        <w:rPr>
+          <w:sz w:val="24"/>
+          <w:szCs w:val="24"/>
+        </w:rPr>
+      </w:pPr>
+      <w:r>
+        <w:rPr>
+          <w:noProof/>
+        </w:rPr>
+        <w:drawing>
+          <wp:inline distT="0" distB="0" distL="0" distR="0" wp14:anchorId="479DEE85" wp14:editId="04990809">
+            <wp:extent cx="6431280" cy="3836278"/>
+            <wp:effectExtent l="0" t="0" r="7620" b="0"/>
+            <wp:docPr id="1630323588" name="Picture 2"/>
+            <wp:cNvGraphicFramePr>
+              <a:graphicFrameLocks xmlns:a="http://schemas.openxmlformats.org/drawingml/2006/main" noChangeAspect="1"/>
+            </wp:cNvGraphicFramePr>
+            <a:graphic xmlns:a="http://schemas.openxmlformats.org/drawingml/2006/main">
+              <a:graphicData uri="http://schemas.openxmlformats.org/drawingml/2006/picture">
+                <pic:pic xmlns:pic="http://schemas.openxmlformats.org/drawingml/2006/picture">
+                  <pic:nvPicPr>
+                    <pic:cNvPr id="0" name="Picture 3"/>
+                    <pic:cNvPicPr>
+                      <a:picLocks noChangeAspect="1" noChangeArrowheads="1"/>
+                    </pic:cNvPicPr>
+                  </pic:nvPicPr>
+                  <pic:blipFill>
+                    <a:blip r:embed="rId25">
+                      <a:extLst>
+                        <a:ext uri="{28A0092B-C50C-407E-A947-70E740481C1C}">
+                          <a14:useLocalDpi xmlns:a14="http://schemas.microsoft.com/office/drawing/2010/main" val="0"/>
+                        </a:ext>
+                      </a:extLst>
+                    </a:blip>
+                    <a:srcRect/>
+                    <a:stretch>
+                      <a:fillRect/>
+                    </a:stretch>
+                  </pic:blipFill>
+                  <pic:spPr bwMode="auto">
+                    <a:xfrm>
+                      <a:off x="0" y="0"/>
+                      <a:ext cx="6435196" cy="3838614"/>
+                    </a:xfrm>
+                    <a:prstGeom prst="rect">
+                      <a:avLst/>
+                    </a:prstGeom>
+                    <a:noFill/>
+                    <a:ln>
+                      <a:noFill/>
+                    </a:ln>
+                  </pic:spPr>
+                </pic:pic>
+              </a:graphicData>
+            </a:graphic>
+          </wp:inline>
+        </w:drawing>
+      </w:r>
+    </w:p>
+    <w:p>
+      <w:pPr>
+        <w:rPr>
+          <w:sz w:val="24"/>
+          <w:szCs w:val="24"/>
+        </w:rPr>
+      </w:pPr>
+    </w:p>
+    <w:p>
+      <w:pPr>
+        <w:rPr>
+          <w:sz w:val="24"/>
+          <w:szCs w:val="24"/>
+        </w:rPr>
+      </w:pPr>
+    </w:p>
+    <w:p>
+      <w:pPr>
+        <w:rPr>
+          <w:sz w:val="24"/>
+          <w:szCs w:val="24"/>
+        </w:rPr>
+      </w:pPr>
+    </w:p>
+    <w:p>
+      <w:pPr>
+        <w:rPr>
+          <w:sz w:val="24"/>
+          <w:szCs w:val="24"/>
+        </w:rPr>
+      </w:pPr>
+    </w:p>
+    <w:p>
+      <w:pPr>
+        <w:rPr>
+          <w:sz w:val="24"/>
+          <w:szCs w:val="24"/>
+        </w:rPr>
+      </w:pPr>
+    </w:p>
+    <w:p>
+      <w:pPr>
+        <w:rPr>
+          <w:sz w:val="24"/>
+          <w:szCs w:val="24"/>
+        </w:rPr>
+      </w:pPr>
+    </w:p>
+    <w:p>
+      <w:pPr>
+        <w:rPr>
+          <w:sz w:val="24"/>
+          <w:szCs w:val="24"/>
+        </w:rPr>
+      </w:pPr>
+    </w:p>
+    <w:p>
+      <w:pPr>
+        <w:rPr>
+          <w:b/>
+          <w:bCs/>
+          <w:sz w:val="36"/>
+          <w:szCs w:val="36"/>
+        </w:rPr>
+      </w:pPr>
+      <w:r>
+        <w:rPr>
+          <w:b/>
+          <w:bCs/>
+          <w:sz w:val="36"/>
+          <w:szCs w:val="36"/>
+        </w:rPr>
+        <w:lastRenderedPageBreak/>
+        <w:t>ABOUT THE PROJECT:</w:t>
+      </w:r>
+    </w:p>
+    <w:p>
+      <w:pPr>
+        <w:rPr>
+          <w:sz w:val="24"/>
+          <w:szCs w:val="24"/>
+        </w:rPr>
+      </w:pPr>
+      <w:r>
+        <w:rPr>
+          <w:sz w:val="24"/>
+          <w:szCs w:val="24"/>
+        </w:rPr>
+        <w:t>This project is an AI-powered skin lesion analysis web app with two-step diagnosis logic.</w:t>
+      </w:r>
+    </w:p>
+    <w:p>
+      <w:pPr>
+        <w:pStyle w:val="ListParagraph"/>
+        <w:numPr>
+          <w:ilvl w:val="0"/>
+          <w:numId w:val="16"/>
+        </w:numPr>
+        <w:spacing w:after="0"/>
+        <w:rPr>
+          <w:sz w:val="24"/>
+          <w:szCs w:val="24"/>
+        </w:rPr>
+      </w:pPr>
+      <w:r>
+        <w:rPr>
+          <w:b/>
+          <w:bCs/>
+          <w:sz w:val="24"/>
+          <w:szCs w:val="24"/>
+        </w:rPr>
+        <w:t>Image upload and preview</w:t>
+      </w:r>
+      <w:r>
+        <w:rPr>
+          <w:sz w:val="24"/>
+          <w:szCs w:val="24"/>
+        </w:rPr>
+        <w:br/>
+        <w:t>The user uploads a skin image in the browser, sees a preview, and sends it to the Flask backend.</w:t>
+      </w:r>
+    </w:p>
+    <w:p>
+      <w:pPr>
+        <w:pStyle w:val="ListParagraph"/>
+        <w:numPr>
+          <w:ilvl w:val="0"/>
+          <w:numId w:val="16"/>
+        </w:numPr>
+        <w:spacing w:after="0"/>
+        <w:rPr>
+          <w:sz w:val="24"/>
+          <w:szCs w:val="24"/>
+        </w:rPr>
+      </w:pPr>
+      <w:r>
+        <w:rPr>
+          <w:b/>
+          <w:bCs/>
+          <w:sz w:val="24"/>
+          <w:szCs w:val="24"/>
+        </w:rPr>
+        <w:t>Lesion type prediction (primary model)</w:t>
+      </w:r>
+      <w:r>
+        <w:rPr>
+          <w:sz w:val="24"/>
+          <w:szCs w:val="24"/>
+        </w:rPr>
+        <w:br/>
+        <w:t>The backend preprocesses the image (resize + normalize) and runs a TensorFlow MobileNetV2-based classifier to identify one of 7 lesion classes:</w:t>
+      </w:r>
+      <w:r>
+        <w:rPr>
+          <w:sz w:val="24"/>
+          <w:szCs w:val="24"/>
+        </w:rPr>
+        <w:br/>
+      </w:r>
+      <w:proofErr w:type="spellStart"/>
+      <w:r>
+        <w:rPr>
+          <w:sz w:val="24"/>
+          <w:szCs w:val="24"/>
+        </w:rPr>
+        <w:t>akiec</w:t>
+      </w:r>
+      <w:proofErr w:type="spellEnd"/>
+      <w:r>
+        <w:rPr>
+          <w:sz w:val="24"/>
+          <w:szCs w:val="24"/>
+        </w:rPr>
+        <w:t>, bcc, </w:t>
+      </w:r>
+      <w:proofErr w:type="spellStart"/>
+      <w:r>
+        <w:rPr>
+          <w:sz w:val="24"/>
+          <w:szCs w:val="24"/>
+        </w:rPr>
+        <w:t>bkl</w:t>
+      </w:r>
+      <w:proofErr w:type="spellEnd"/>
+      <w:r>
+        <w:rPr>
+          <w:sz w:val="24"/>
+          <w:szCs w:val="24"/>
+        </w:rPr>
+        <w:t>, </w:t>
+      </w:r>
+      <w:proofErr w:type="spellStart"/>
+      <w:r>
+        <w:rPr>
+          <w:sz w:val="24"/>
+          <w:szCs w:val="24"/>
+        </w:rPr>
+        <w:t>df</w:t>
+      </w:r>
+      <w:proofErr w:type="spellEnd"/>
+      <w:r>
+        <w:rPr>
+          <w:sz w:val="24"/>
+          <w:szCs w:val="24"/>
+        </w:rPr>
+        <w:t>, mel, </w:t>
+      </w:r>
+      <w:proofErr w:type="spellStart"/>
+      <w:r>
+        <w:rPr>
+          <w:sz w:val="24"/>
+          <w:szCs w:val="24"/>
+        </w:rPr>
+        <w:t>nv</w:t>
+      </w:r>
+      <w:proofErr w:type="spellEnd"/>
+      <w:r>
+        <w:rPr>
+          <w:sz w:val="24"/>
+          <w:szCs w:val="24"/>
+        </w:rPr>
+        <w:t>, </w:t>
+      </w:r>
+      <w:proofErr w:type="spellStart"/>
+      <w:r>
+        <w:rPr>
+          <w:sz w:val="24"/>
+          <w:szCs w:val="24"/>
+        </w:rPr>
+        <w:t>vasc</w:t>
+      </w:r>
+      <w:proofErr w:type="spellEnd"/>
+      <w:r>
+        <w:rPr>
+          <w:sz w:val="24"/>
+          <w:szCs w:val="24"/>
+        </w:rPr>
+        <w:br/>
+        <w:t>It also calculates confidence for that class.</w:t>
+      </w:r>
+    </w:p>
+    <w:p>
+      <w:pPr>
+        <w:pStyle w:val="ListParagraph"/>
+        <w:numPr>
+          <w:ilvl w:val="0"/>
+          <w:numId w:val="16"/>
+        </w:numPr>
+        <w:spacing w:after="0"/>
+        <w:rPr>
+          <w:b/>
+          <w:bCs/>
+          <w:sz w:val="24"/>
+          <w:szCs w:val="24"/>
+        </w:rPr>
+      </w:pPr>
+      <w:r>
+        <w:rPr>
+          <w:b/>
+          <w:bCs/>
+          <w:sz w:val="24"/>
+          <w:szCs w:val="24"/>
+        </w:rPr>
+        <w:t>Melanoma stage prediction (secondary model)</w:t>
+      </w:r>
+    </w:p>
+    <w:p>
+      <w:pPr>
+        <w:spacing w:after="0"/>
+        <w:ind w:left="720"/>
+        <w:rPr>
+          <w:sz w:val="24"/>
+          <w:szCs w:val="24"/>
+        </w:rPr>
+      </w:pPr>
+      <w:r>
+        <w:rPr>
+          <w:sz w:val="24"/>
+          <w:szCs w:val="24"/>
+        </w:rPr>
+        <w:t>If the predicted lesion is not melanoma, the app returns only lesion type + confidence.</w:t>
+      </w:r>
+    </w:p>
+    <w:p>
+      <w:pPr>
+        <w:spacing w:after="0"/>
+        <w:ind w:left="720"/>
+        <w:rPr>
+          <w:sz w:val="24"/>
+          <w:szCs w:val="24"/>
+        </w:rPr>
+      </w:pPr>
+      <w:r>
+        <w:rPr>
+          <w:sz w:val="24"/>
+          <w:szCs w:val="24"/>
+        </w:rPr>
+        <w:t>If it is melanoma (mel), the app runs a second model (melanoma_stage_model.h5) on the same processed image to predict stage:</w:t>
+      </w:r>
+    </w:p>
+    <w:p>
+      <w:pPr>
+        <w:spacing w:after="0"/>
+        <w:ind w:left="720"/>
+        <w:rPr>
+          <w:sz w:val="24"/>
+          <w:szCs w:val="24"/>
+        </w:rPr>
+      </w:pPr>
+      <w:r>
+        <w:rPr>
+          <w:sz w:val="24"/>
+          <w:szCs w:val="24"/>
+        </w:rPr>
+        <w:t>Low, Intermediate, or High, with stage confidence.</w:t>
+      </w:r>
+    </w:p>
+    <w:p>
+      <w:pPr>
+        <w:pStyle w:val="ListParagraph"/>
+        <w:numPr>
+          <w:ilvl w:val="0"/>
+          <w:numId w:val="16"/>
+        </w:numPr>
+        <w:spacing w:after="0"/>
+        <w:rPr>
+          <w:b/>
+          <w:bCs/>
+          <w:sz w:val="24"/>
+          <w:szCs w:val="24"/>
+        </w:rPr>
+      </w:pPr>
+      <w:r>
+        <w:rPr>
+          <w:b/>
+          <w:bCs/>
+          <w:sz w:val="24"/>
+          <w:szCs w:val="24"/>
+        </w:rPr>
+        <w:t>Smart response handling in UI</w:t>
+      </w:r>
+    </w:p>
+    <w:p>
+      <w:pPr>
+        <w:pStyle w:val="ListParagraph"/>
+        <w:numPr>
+          <w:ilvl w:val="0"/>
+          <w:numId w:val="16"/>
+        </w:numPr>
+        <w:spacing w:after="0"/>
+        <w:rPr>
+          <w:b/>
+          <w:bCs/>
+          <w:sz w:val="24"/>
+          <w:szCs w:val="24"/>
+        </w:rPr>
+      </w:pPr>
+      <w:r>
+        <w:rPr>
+          <w:b/>
+          <w:bCs/>
+          <w:sz w:val="24"/>
+          <w:szCs w:val="24"/>
+        </w:rPr>
+        <w:t>The frontend displays:</w:t>
+      </w:r>
+    </w:p>
+    <w:p>
+      <w:pPr>
+        <w:spacing w:after="0"/>
+        <w:ind w:left="720"/>
+        <w:rPr>
+          <w:sz w:val="24"/>
+          <w:szCs w:val="24"/>
+        </w:rPr>
+      </w:pPr>
+      <w:r>
+        <w:rPr>
+          <w:sz w:val="24"/>
+          <w:szCs w:val="24"/>
+        </w:rPr>
+        <w:t>Non-melanoma: detected lesion type + confidence</w:t>
+      </w:r>
+    </w:p>
+    <w:p>
+      <w:pPr>
+        <w:spacing w:after="0"/>
+        <w:ind w:left="720"/>
+        <w:rPr>
+          <w:sz w:val="24"/>
+          <w:szCs w:val="24"/>
+        </w:rPr>
+      </w:pPr>
+      <w:r>
+        <w:rPr>
+          <w:sz w:val="24"/>
+          <w:szCs w:val="24"/>
+        </w:rPr>
+        <w:t>Melanoma: “Detected: Melanoma”, predicted stage, lesion confidence, and stage confidence</w:t>
+      </w:r>
+    </w:p>
+    <w:p>
+      <w:pPr>
+        <w:spacing w:after="0"/>
+        <w:ind w:left="720"/>
+        <w:rPr>
+          <w:sz w:val="24"/>
+          <w:szCs w:val="24"/>
+        </w:rPr>
+      </w:pPr>
+    </w:p>
+    <w:p>
+      <w:pPr>
+        <w:spacing w:after="0"/>
         <w:rPr>
           <w:sz w:val="24"/>
           <w:szCs w:val="24"/>
@@ -4458,6 +6994,155 @@
     </w:lvl>
   </w:abstractNum>
   <w:abstractNum w:abstractNumId="1" w15:restartNumberingAfterBreak="0">
+    <w:nsid w:val="02721128"/>
+    <w:multiLevelType w:val="multilevel"/>
+    <w:tmpl w:val="9BAA75FE"/>
+    <w:lvl w:ilvl="0">
+      <w:start w:val="1"/>
+      <w:numFmt w:val="bullet"/>
+      <w:lvlText w:val=""/>
+      <w:lvlJc w:val="left"/>
+      <w:pPr>
+        <w:tabs>
+          <w:tab w:val="num" w:pos="720"/>
+        </w:tabs>
+        <w:ind w:left="720" w:hanging="360"/>
+      </w:pPr>
+      <w:rPr>
+        <w:rFonts w:ascii="Symbol" w:hAnsi="Symbol" w:hint="default"/>
+        <w:sz w:val="20"/>
+      </w:rPr>
+    </w:lvl>
+    <w:lvl w:ilvl="1" w:tentative="1">
+      <w:start w:val="1"/>
+      <w:numFmt w:val="bullet"/>
+      <w:lvlText w:val="o"/>
+      <w:lvlJc w:val="left"/>
+      <w:pPr>
+        <w:tabs>
+          <w:tab w:val="num" w:pos="1440"/>
+        </w:tabs>
+        <w:ind w:left="1440" w:hanging="360"/>
+      </w:pPr>
+      <w:rPr>
+        <w:rFonts w:ascii="Courier New" w:hAnsi="Courier New" w:hint="default"/>
+        <w:sz w:val="20"/>
+      </w:rPr>
+    </w:lvl>
+    <w:lvl w:ilvl="2" w:tentative="1">
+      <w:start w:val="1"/>
+      <w:numFmt w:val="bullet"/>
+      <w:lvlText w:val=""/>
+      <w:lvlJc w:val="left"/>
+      <w:pPr>
+        <w:tabs>
+          <w:tab w:val="num" w:pos="2160"/>
+        </w:tabs>
+        <w:ind w:left="2160" w:hanging="360"/>
+      </w:pPr>
+      <w:rPr>
+        <w:rFonts w:ascii="Wingdings" w:hAnsi="Wingdings" w:hint="default"/>
+        <w:sz w:val="20"/>
+      </w:rPr>
+    </w:lvl>
+    <w:lvl w:ilvl="3" w:tentative="1">
+      <w:start w:val="1"/>
+      <w:numFmt w:val="bullet"/>
+      <w:lvlText w:val=""/>
+      <w:lvlJc w:val="left"/>
+      <w:pPr>
+        <w:tabs>
+          <w:tab w:val="num" w:pos="2880"/>
+        </w:tabs>
+        <w:ind w:left="2880" w:hanging="360"/>
+      </w:pPr>
+      <w:rPr>
+        <w:rFonts w:ascii="Wingdings" w:hAnsi="Wingdings" w:hint="default"/>
+        <w:sz w:val="20"/>
+      </w:rPr>
+    </w:lvl>
+    <w:lvl w:ilvl="4" w:tentative="1">
+      <w:start w:val="1"/>
+      <w:numFmt w:val="bullet"/>
+      <w:lvlText w:val=""/>
+      <w:lvlJc w:val="left"/>
+      <w:pPr>
+        <w:tabs>
+          <w:tab w:val="num" w:pos="3600"/>
+        </w:tabs>
+        <w:ind w:left="3600" w:hanging="360"/>
+      </w:pPr>
+      <w:rPr>
+        <w:rFonts w:ascii="Wingdings" w:hAnsi="Wingdings" w:hint="default"/>
+        <w:sz w:val="20"/>
+      </w:rPr>
+    </w:lvl>
+    <w:lvl w:ilvl="5" w:tentative="1">
+      <w:start w:val="1"/>
+      <w:numFmt w:val="bullet"/>
+      <w:lvlText w:val=""/>
+      <w:lvlJc w:val="left"/>
+      <w:pPr>
+        <w:tabs>
+          <w:tab w:val="num" w:pos="4320"/>
+        </w:tabs>
+        <w:ind w:left="4320" w:hanging="360"/>
+      </w:pPr>
+      <w:rPr>
+        <w:rFonts w:ascii="Wingdings" w:hAnsi="Wingdings" w:hint="default"/>
+        <w:sz w:val="20"/>
+      </w:rPr>
+    </w:lvl>
+    <w:lvl w:ilvl="6" w:tentative="1">
+      <w:start w:val="1"/>
+      <w:numFmt w:val="bullet"/>
+      <w:lvlText w:val=""/>
+      <w:lvlJc w:val="left"/>
+      <w:pPr>
+        <w:tabs>
+          <w:tab w:val="num" w:pos="5040"/>
+        </w:tabs>
+        <w:ind w:left="5040" w:hanging="360"/>
+      </w:pPr>
+      <w:rPr>
+        <w:rFonts w:ascii="Wingdings" w:hAnsi="Wingdings" w:hint="default"/>
+        <w:sz w:val="20"/>
+      </w:rPr>
+    </w:lvl>
+    <w:lvl w:ilvl="7" w:tentative="1">
+      <w:start w:val="1"/>
+      <w:numFmt w:val="bullet"/>
+      <w:lvlText w:val=""/>
+      <w:lvlJc w:val="left"/>
+      <w:pPr>
+        <w:tabs>
+          <w:tab w:val="num" w:pos="5760"/>
+        </w:tabs>
+        <w:ind w:left="5760" w:hanging="360"/>
+      </w:pPr>
+      <w:rPr>
+        <w:rFonts w:ascii="Wingdings" w:hAnsi="Wingdings" w:hint="default"/>
+        <w:sz w:val="20"/>
+      </w:rPr>
+    </w:lvl>
+    <w:lvl w:ilvl="8" w:tentative="1">
+      <w:start w:val="1"/>
+      <w:numFmt w:val="bullet"/>
+      <w:lvlText w:val=""/>
+      <w:lvlJc w:val="left"/>
+      <w:pPr>
+        <w:tabs>
+          <w:tab w:val="num" w:pos="6480"/>
+        </w:tabs>
+        <w:ind w:left="6480" w:hanging="360"/>
+      </w:pPr>
+      <w:rPr>
+        <w:rFonts w:ascii="Wingdings" w:hAnsi="Wingdings" w:hint="default"/>
+        <w:sz w:val="20"/>
+      </w:rPr>
+    </w:lvl>
+  </w:abstractNum>
+  <w:abstractNum w:abstractNumId="2" w15:restartNumberingAfterBreak="0">
     <w:nsid w:val="0FCD56A2"/>
     <w:multiLevelType w:val="multilevel"/>
     <w:tmpl w:val="9ED4C856"/>
@@ -4606,7 +7291,7 @@
       </w:rPr>
     </w:lvl>
   </w:abstractNum>
-  <w:abstractNum w:abstractNumId="2" w15:restartNumberingAfterBreak="0">
+  <w:abstractNum w:abstractNumId="3" w15:restartNumberingAfterBreak="0">
     <w:nsid w:val="167C4C9B"/>
     <w:multiLevelType w:val="multilevel"/>
     <w:tmpl w:val="433CAAFA"/>
@@ -4755,7 +7440,7 @@
       </w:rPr>
     </w:lvl>
   </w:abstractNum>
-  <w:abstractNum w:abstractNumId="3" w15:restartNumberingAfterBreak="0">
+  <w:abstractNum w:abstractNumId="4" w15:restartNumberingAfterBreak="0">
     <w:nsid w:val="1BE14C24"/>
     <w:multiLevelType w:val="multilevel"/>
     <w:tmpl w:val="ADC865F4"/>
@@ -4900,7 +7585,7 @@
       </w:rPr>
     </w:lvl>
   </w:abstractNum>
-  <w:abstractNum w:abstractNumId="4" w15:restartNumberingAfterBreak="0">
+  <w:abstractNum w:abstractNumId="5" w15:restartNumberingAfterBreak="0">
     <w:nsid w:val="1CD83AAC"/>
     <w:multiLevelType w:val="multilevel"/>
     <w:tmpl w:val="504ABB6E"/>
@@ -5049,7 +7734,7 @@
       </w:rPr>
     </w:lvl>
   </w:abstractNum>
-  <w:abstractNum w:abstractNumId="5" w15:restartNumberingAfterBreak="0">
+  <w:abstractNum w:abstractNumId="6" w15:restartNumberingAfterBreak="0">
     <w:nsid w:val="211A2BD3"/>
     <w:multiLevelType w:val="multilevel"/>
     <w:tmpl w:val="0FFA70EE"/>
@@ -5198,7 +7883,120 @@
       </w:rPr>
     </w:lvl>
   </w:abstractNum>
-  <w:abstractNum w:abstractNumId="6" w15:restartNumberingAfterBreak="0">
+  <w:abstractNum w:abstractNumId="7" w15:restartNumberingAfterBreak="0">
+    <w:nsid w:val="24354DD5"/>
+    <w:multiLevelType w:val="multilevel"/>
+    <w:tmpl w:val="61F8E2D6"/>
+    <w:lvl w:ilvl="0">
+      <w:start w:val="1"/>
+      <w:numFmt w:val="decimal"/>
+      <w:lvlText w:val="%1."/>
+      <w:lvlJc w:val="left"/>
+      <w:pPr>
+        <w:tabs>
+          <w:tab w:val="num" w:pos="720"/>
+        </w:tabs>
+        <w:ind w:left="720" w:hanging="360"/>
+      </w:pPr>
+    </w:lvl>
+    <w:lvl w:ilvl="1" w:tentative="1">
+      <w:start w:val="1"/>
+      <w:numFmt w:val="decimal"/>
+      <w:lvlText w:val="%2."/>
+      <w:lvlJc w:val="left"/>
+      <w:pPr>
+        <w:tabs>
+          <w:tab w:val="num" w:pos="1440"/>
+        </w:tabs>
+        <w:ind w:left="1440" w:hanging="360"/>
+      </w:pPr>
+    </w:lvl>
+    <w:lvl w:ilvl="2" w:tentative="1">
+      <w:start w:val="1"/>
+      <w:numFmt w:val="decimal"/>
+      <w:lvlText w:val="%3."/>
+      <w:lvlJc w:val="left"/>
+      <w:pPr>
+        <w:tabs>
+          <w:tab w:val="num" w:pos="2160"/>
+        </w:tabs>
+        <w:ind w:left="2160" w:hanging="360"/>
+      </w:pPr>
+    </w:lvl>
+    <w:lvl w:ilvl="3" w:tentative="1">
+      <w:start w:val="1"/>
+      <w:numFmt w:val="decimal"/>
+      <w:lvlText w:val="%4."/>
+      <w:lvlJc w:val="left"/>
+      <w:pPr>
+        <w:tabs>
+          <w:tab w:val="num" w:pos="2880"/>
+        </w:tabs>
+        <w:ind w:left="2880" w:hanging="360"/>
+      </w:pPr>
+    </w:lvl>
+    <w:lvl w:ilvl="4" w:tentative="1">
+      <w:start w:val="1"/>
+      <w:numFmt w:val="decimal"/>
+      <w:lvlText w:val="%5."/>
+      <w:lvlJc w:val="left"/>
+      <w:pPr>
+        <w:tabs>
+          <w:tab w:val="num" w:pos="3600"/>
+        </w:tabs>
+        <w:ind w:left="3600" w:hanging="360"/>
+      </w:pPr>
+    </w:lvl>
+    <w:lvl w:ilvl="5" w:tentative="1">
+      <w:start w:val="1"/>
+      <w:numFmt w:val="decimal"/>
+      <w:lvlText w:val="%6."/>
+      <w:lvlJc w:val="left"/>
+      <w:pPr>
+        <w:tabs>
+          <w:tab w:val="num" w:pos="4320"/>
+        </w:tabs>
+        <w:ind w:left="4320" w:hanging="360"/>
+      </w:pPr>
+    </w:lvl>
+    <w:lvl w:ilvl="6" w:tentative="1">
+      <w:start w:val="1"/>
+      <w:numFmt w:val="decimal"/>
+      <w:lvlText w:val="%7."/>
+      <w:lvlJc w:val="left"/>
+      <w:pPr>
+        <w:tabs>
+          <w:tab w:val="num" w:pos="5040"/>
+        </w:tabs>
+        <w:ind w:left="5040" w:hanging="360"/>
+      </w:pPr>
+    </w:lvl>
+    <w:lvl w:ilvl="7" w:tentative="1">
+      <w:start w:val="1"/>
+      <w:numFmt w:val="decimal"/>
+      <w:lvlText w:val="%8."/>
+      <w:lvlJc w:val="left"/>
+      <w:pPr>
+        <w:tabs>
+          <w:tab w:val="num" w:pos="5760"/>
+        </w:tabs>
+        <w:ind w:left="5760" w:hanging="360"/>
+      </w:pPr>
+    </w:lvl>
+    <w:lvl w:ilvl="8" w:tentative="1">
+      <w:start w:val="1"/>
+      <w:numFmt w:val="decimal"/>
+      <w:lvlText w:val="%9."/>
+      <w:lvlJc w:val="left"/>
+      <w:pPr>
+        <w:tabs>
+          <w:tab w:val="num" w:pos="6480"/>
+        </w:tabs>
+        <w:ind w:left="6480" w:hanging="360"/>
+      </w:pPr>
+    </w:lvl>
+  </w:abstractNum>
+  <w:abstractNum w:abstractNumId="8" w15:restartNumberingAfterBreak="0">
     <w:nsid w:val="31320E7F"/>
     <w:multiLevelType w:val="multilevel"/>
     <w:tmpl w:val="B0C614CE"/>
@@ -5315,7 +8113,233 @@
       </w:pPr>
     </w:lvl>
   </w:abstractNum>
-  <w:abstractNum w:abstractNumId="7" w15:restartNumberingAfterBreak="0">
+  <w:abstractNum w:abstractNumId="9" w15:restartNumberingAfterBreak="0">
+    <w:nsid w:val="35EB2875"/>
+    <w:multiLevelType w:val="hybridMultilevel"/>
+    <w:tmpl w:val="31BA279C"/>
+    <w:lvl w:ilvl="0" w:tplc="40090001">
+      <w:start w:val="1"/>
+      <w:numFmt w:val="bullet"/>
+      <w:lvlText w:val=""/>
+      <w:lvlJc w:val="left"/>
+      <w:pPr>
+        <w:ind w:left="720" w:hanging="360"/>
+      </w:pPr>
+      <w:rPr>
+        <w:rFonts w:ascii="Symbol" w:hAnsi="Symbol" w:hint="default"/>
+      </w:rPr>
+    </w:lvl>
+    <w:lvl w:ilvl="1" w:tplc="40090003" w:tentative="1">
+      <w:start w:val="1"/>
+      <w:numFmt w:val="bullet"/>
+      <w:lvlText w:val="o"/>
+      <w:lvlJc w:val="left"/>
+      <w:pPr>
+        <w:ind w:left="1440" w:hanging="360"/>
+      </w:pPr>
+      <w:rPr>
+        <w:rFonts w:ascii="Courier New" w:hAnsi="Courier New" w:cs="Courier New" w:hint="default"/>
+      </w:rPr>
+    </w:lvl>
+    <w:lvl w:ilvl="2" w:tplc="40090005" w:tentative="1">
+      <w:start w:val="1"/>
+      <w:numFmt w:val="bullet"/>
+      <w:lvlText w:val=""/>
+      <w:lvlJc w:val="left"/>
+      <w:pPr>
+        <w:ind w:left="2160" w:hanging="360"/>
+      </w:pPr>
+      <w:rPr>
+        <w:rFonts w:ascii="Wingdings" w:hAnsi="Wingdings" w:hint="default"/>
+      </w:rPr>
+    </w:lvl>
+    <w:lvl w:ilvl="3" w:tplc="40090001" w:tentative="1">
+      <w:start w:val="1"/>
+      <w:numFmt w:val="bullet"/>
+      <w:lvlText w:val=""/>
+      <w:lvlJc w:val="left"/>
+      <w:pPr>
+        <w:ind w:left="2880" w:hanging="360"/>
+      </w:pPr>
+      <w:rPr>
+        <w:rFonts w:ascii="Symbol" w:hAnsi="Symbol" w:hint="default"/>
+      </w:rPr>
+    </w:lvl>
+    <w:lvl w:ilvl="4" w:tplc="40090003" w:tentative="1">
+      <w:start w:val="1"/>
+      <w:numFmt w:val="bullet"/>
+      <w:lvlText w:val="o"/>
+      <w:lvlJc w:val="left"/>
+      <w:pPr>
+        <w:ind w:left="3600" w:hanging="360"/>
+      </w:pPr>
+      <w:rPr>
+        <w:rFonts w:ascii="Courier New" w:hAnsi="Courier New" w:cs="Courier New" w:hint="default"/>
+      </w:rPr>
+    </w:lvl>
+    <w:lvl w:ilvl="5" w:tplc="40090005" w:tentative="1">
+      <w:start w:val="1"/>
+      <w:numFmt w:val="bullet"/>
+      <w:lvlText w:val=""/>
+      <w:lvlJc w:val="left"/>
+      <w:pPr>
+        <w:ind w:left="4320" w:hanging="360"/>
+      </w:pPr>
+      <w:rPr>
+        <w:rFonts w:ascii="Wingdings" w:hAnsi="Wingdings" w:hint="default"/>
+      </w:rPr>
+    </w:lvl>
+    <w:lvl w:ilvl="6" w:tplc="40090001" w:tentative="1">
+      <w:start w:val="1"/>
+      <w:numFmt w:val="bullet"/>
+      <w:lvlText w:val=""/>
+      <w:lvlJc w:val="left"/>
+      <w:pPr>
+        <w:ind w:left="5040" w:hanging="360"/>
+      </w:pPr>
+      <w:rPr>
+        <w:rFonts w:ascii="Symbol" w:hAnsi="Symbol" w:hint="default"/>
+      </w:rPr>
+    </w:lvl>
+    <w:lvl w:ilvl="7" w:tplc="40090003" w:tentative="1">
+      <w:start w:val="1"/>
+      <w:numFmt w:val="bullet"/>
+      <w:lvlText w:val="o"/>
+      <w:lvlJc w:val="left"/>
+      <w:pPr>
+        <w:ind w:left="5760" w:hanging="360"/>
+      </w:pPr>
+      <w:rPr>
+        <w:rFonts w:ascii="Courier New" w:hAnsi="Courier New" w:cs="Courier New" w:hint="default"/>
+      </w:rPr>
+    </w:lvl>
+    <w:lvl w:ilvl="8" w:tplc="40090005" w:tentative="1">
+      <w:start w:val="1"/>
+      <w:numFmt w:val="bullet"/>
+      <w:lvlText w:val=""/>
+      <w:lvlJc w:val="left"/>
+      <w:pPr>
+        <w:ind w:left="6480" w:hanging="360"/>
+      </w:pPr>
+      <w:rPr>
+        <w:rFonts w:ascii="Wingdings" w:hAnsi="Wingdings" w:hint="default"/>
+      </w:rPr>
+    </w:lvl>
+  </w:abstractNum>
+  <w:abstractNum w:abstractNumId="10" w15:restartNumberingAfterBreak="0">
+    <w:nsid w:val="408A238A"/>
+    <w:multiLevelType w:val="hybridMultilevel"/>
+    <w:tmpl w:val="2FFEAFC2"/>
+    <w:lvl w:ilvl="0" w:tplc="40090001">
+      <w:start w:val="1"/>
+      <w:numFmt w:val="bullet"/>
+      <w:lvlText w:val=""/>
+      <w:lvlJc w:val="left"/>
+      <w:pPr>
+        <w:ind w:left="1440" w:hanging="360"/>
+      </w:pPr>
+      <w:rPr>
+        <w:rFonts w:ascii="Symbol" w:hAnsi="Symbol" w:hint="default"/>
+      </w:rPr>
+    </w:lvl>
+    <w:lvl w:ilvl="1" w:tplc="40090003" w:tentative="1">
+      <w:start w:val="1"/>
+      <w:numFmt w:val="bullet"/>
+      <w:lvlText w:val="o"/>
+      <w:lvlJc w:val="left"/>
+      <w:pPr>
+        <w:ind w:left="2160" w:hanging="360"/>
+      </w:pPr>
+      <w:rPr>
+        <w:rFonts w:ascii="Courier New" w:hAnsi="Courier New" w:cs="Courier New" w:hint="default"/>
+      </w:rPr>
+    </w:lvl>
+    <w:lvl w:ilvl="2" w:tplc="40090005" w:tentative="1">
+      <w:start w:val="1"/>
+      <w:numFmt w:val="bullet"/>
+      <w:lvlText w:val=""/>
+      <w:lvlJc w:val="left"/>
+      <w:pPr>
+        <w:ind w:left="2880" w:hanging="360"/>
+      </w:pPr>
+      <w:rPr>
+        <w:rFonts w:ascii="Wingdings" w:hAnsi="Wingdings" w:hint="default"/>
+      </w:rPr>
+    </w:lvl>
+    <w:lvl w:ilvl="3" w:tplc="40090001" w:tentative="1">
+      <w:start w:val="1"/>
+      <w:numFmt w:val="bullet"/>
+      <w:lvlText w:val=""/>
+      <w:lvlJc w:val="left"/>
+      <w:pPr>
+        <w:ind w:left="3600" w:hanging="360"/>
+      </w:pPr>
+      <w:rPr>
+        <w:rFonts w:ascii="Symbol" w:hAnsi="Symbol" w:hint="default"/>
+      </w:rPr>
+    </w:lvl>
+    <w:lvl w:ilvl="4" w:tplc="40090003" w:tentative="1">
+      <w:start w:val="1"/>
+      <w:numFmt w:val="bullet"/>
+      <w:lvlText w:val="o"/>
+      <w:lvlJc w:val="left"/>
+      <w:pPr>
+        <w:ind w:left="4320" w:hanging="360"/>
+      </w:pPr>
+      <w:rPr>
+        <w:rFonts w:ascii="Courier New" w:hAnsi="Courier New" w:cs="Courier New" w:hint="default"/>
+      </w:rPr>
+    </w:lvl>
+    <w:lvl w:ilvl="5" w:tplc="40090005" w:tentative="1">
+      <w:start w:val="1"/>
+      <w:numFmt w:val="bullet"/>
+      <w:lvlText w:val=""/>
+      <w:lvlJc w:val="left"/>
+      <w:pPr>
+        <w:ind w:left="5040" w:hanging="360"/>
+      </w:pPr>
+      <w:rPr>
+        <w:rFonts w:ascii="Wingdings" w:hAnsi="Wingdings" w:hint="default"/>
+      </w:rPr>
+    </w:lvl>
+    <w:lvl w:ilvl="6" w:tplc="40090001" w:tentative="1">
+      <w:start w:val="1"/>
+      <w:numFmt w:val="bullet"/>
+      <w:lvlText w:val=""/>
+      <w:lvlJc w:val="left"/>
+      <w:pPr>
+        <w:ind w:left="5760" w:hanging="360"/>
+      </w:pPr>
+      <w:rPr>
+        <w:rFonts w:ascii="Symbol" w:hAnsi="Symbol" w:hint="default"/>
+      </w:rPr>
+    </w:lvl>
+    <w:lvl w:ilvl="7" w:tplc="40090003" w:tentative="1">
+      <w:start w:val="1"/>
+      <w:numFmt w:val="bullet"/>
+      <w:lvlText w:val="o"/>
+      <w:lvlJc w:val="left"/>
+      <w:pPr>
+        <w:ind w:left="6480" w:hanging="360"/>
+      </w:pPr>
+      <w:rPr>
+        <w:rFonts w:ascii="Courier New" w:hAnsi="Courier New" w:cs="Courier New" w:hint="default"/>
+      </w:rPr>
+    </w:lvl>
+    <w:lvl w:ilvl="8" w:tplc="40090005" w:tentative="1">
+      <w:start w:val="1"/>
+      <w:numFmt w:val="bullet"/>
+      <w:lvlText w:val=""/>
+      <w:lvlJc w:val="left"/>
+      <w:pPr>
+        <w:ind w:left="7200" w:hanging="360"/>
+      </w:pPr>
+      <w:rPr>
+        <w:rFonts w:ascii="Wingdings" w:hAnsi="Wingdings" w:hint="default"/>
+      </w:rPr>
+    </w:lvl>
+  </w:abstractNum>
+  <w:abstractNum w:abstractNumId="11" w15:restartNumberingAfterBreak="0">
     <w:nsid w:val="46CD693F"/>
     <w:multiLevelType w:val="multilevel"/>
     <w:tmpl w:val="AA202A9C"/>
@@ -5428,7 +8452,7 @@
       </w:pPr>
     </w:lvl>
   </w:abstractNum>
-  <w:abstractNum w:abstractNumId="8" w15:restartNumberingAfterBreak="0">
+  <w:abstractNum w:abstractNumId="12" w15:restartNumberingAfterBreak="0">
     <w:nsid w:val="48A46D84"/>
     <w:multiLevelType w:val="multilevel"/>
     <w:tmpl w:val="6E041A10"/>
@@ -5541,7 +8565,7 @@
       </w:pPr>
     </w:lvl>
   </w:abstractNum>
-  <w:abstractNum w:abstractNumId="9" w15:restartNumberingAfterBreak="0">
+  <w:abstractNum w:abstractNumId="13" w15:restartNumberingAfterBreak="0">
     <w:nsid w:val="56ED7850"/>
     <w:multiLevelType w:val="multilevel"/>
     <w:tmpl w:val="C124FA3E"/>
@@ -5658,7 +8682,7 @@
       </w:pPr>
     </w:lvl>
   </w:abstractNum>
-  <w:abstractNum w:abstractNumId="10" w15:restartNumberingAfterBreak="0">
+  <w:abstractNum w:abstractNumId="14" w15:restartNumberingAfterBreak="0">
     <w:nsid w:val="58DF2214"/>
     <w:multiLevelType w:val="multilevel"/>
     <w:tmpl w:val="409AC04A"/>
@@ -5807,7 +8831,7 @@
       </w:rPr>
     </w:lvl>
   </w:abstractNum>
-  <w:abstractNum w:abstractNumId="11" w15:restartNumberingAfterBreak="0">
+  <w:abstractNum w:abstractNumId="15" w15:restartNumberingAfterBreak="0">
     <w:nsid w:val="5EC6168D"/>
     <w:multiLevelType w:val="multilevel"/>
     <w:tmpl w:val="A42A6BA0"/>
@@ -5924,7 +8948,120 @@
       </w:pPr>
     </w:lvl>
   </w:abstractNum>
-  <w:abstractNum w:abstractNumId="12" w15:restartNumberingAfterBreak="0">
+  <w:abstractNum w:abstractNumId="16" w15:restartNumberingAfterBreak="0">
+    <w:nsid w:val="65302FF2"/>
+    <w:multiLevelType w:val="multilevel"/>
+    <w:tmpl w:val="4266C096"/>
+    <w:lvl w:ilvl="0">
+      <w:start w:val="1"/>
+      <w:numFmt w:val="decimal"/>
+      <w:lvlText w:val="%1."/>
+      <w:lvlJc w:val="left"/>
+      <w:pPr>
+        <w:tabs>
+          <w:tab w:val="num" w:pos="720"/>
+        </w:tabs>
+        <w:ind w:left="720" w:hanging="360"/>
+      </w:pPr>
+    </w:lvl>
+    <w:lvl w:ilvl="1" w:tentative="1">
+      <w:start w:val="1"/>
+      <w:numFmt w:val="decimal"/>
+      <w:lvlText w:val="%2."/>
+      <w:lvlJc w:val="left"/>
+      <w:pPr>
+        <w:tabs>
+          <w:tab w:val="num" w:pos="1440"/>
+        </w:tabs>
+        <w:ind w:left="1440" w:hanging="360"/>
+      </w:pPr>
+    </w:lvl>
+    <w:lvl w:ilvl="2" w:tentative="1">
+      <w:start w:val="1"/>
+      <w:numFmt w:val="decimal"/>
+      <w:lvlText w:val="%3."/>
+      <w:lvlJc w:val="left"/>
+      <w:pPr>
+        <w:tabs>
+          <w:tab w:val="num" w:pos="2160"/>
+        </w:tabs>
+        <w:ind w:left="2160" w:hanging="360"/>
+      </w:pPr>
+    </w:lvl>
+    <w:lvl w:ilvl="3" w:tentative="1">
+      <w:start w:val="1"/>
+      <w:numFmt w:val="decimal"/>
+      <w:lvlText w:val="%4."/>
+      <w:lvlJc w:val="left"/>
+      <w:pPr>
+        <w:tabs>
+          <w:tab w:val="num" w:pos="2880"/>
+        </w:tabs>
+        <w:ind w:left="2880" w:hanging="360"/>
+      </w:pPr>
+    </w:lvl>
+    <w:lvl w:ilvl="4" w:tentative="1">
+      <w:start w:val="1"/>
+      <w:numFmt w:val="decimal"/>
+      <w:lvlText w:val="%5."/>
+      <w:lvlJc w:val="left"/>
+      <w:pPr>
+        <w:tabs>
+          <w:tab w:val="num" w:pos="3600"/>
+        </w:tabs>
+        <w:ind w:left="3600" w:hanging="360"/>
+      </w:pPr>
+    </w:lvl>
+    <w:lvl w:ilvl="5" w:tentative="1">
+      <w:start w:val="1"/>
+      <w:numFmt w:val="decimal"/>
+      <w:lvlText w:val="%6."/>
+      <w:lvlJc w:val="left"/>
+      <w:pPr>
+        <w:tabs>
+          <w:tab w:val="num" w:pos="4320"/>
+        </w:tabs>
+        <w:ind w:left="4320" w:hanging="360"/>
+      </w:pPr>
+    </w:lvl>
+    <w:lvl w:ilvl="6" w:tentative="1">
+      <w:start w:val="1"/>
+      <w:numFmt w:val="decimal"/>
+      <w:lvlText w:val="%7."/>
+      <w:lvlJc w:val="left"/>
+      <w:pPr>
+        <w:tabs>
+          <w:tab w:val="num" w:pos="5040"/>
+        </w:tabs>
+        <w:ind w:left="5040" w:hanging="360"/>
+      </w:pPr>
+    </w:lvl>
+    <w:lvl w:ilvl="7" w:tentative="1">
+      <w:start w:val="1"/>
+      <w:numFmt w:val="decimal"/>
+      <w:lvlText w:val="%8."/>
+      <w:lvlJc w:val="left"/>
+      <w:pPr>
+        <w:tabs>
+          <w:tab w:val="num" w:pos="5760"/>
+        </w:tabs>
+        <w:ind w:left="5760" w:hanging="360"/>
+      </w:pPr>
+    </w:lvl>
+    <w:lvl w:ilvl="8" w:tentative="1">
+      <w:start w:val="1"/>
+      <w:numFmt w:val="decimal"/>
+      <w:lvlText w:val="%9."/>
+      <w:lvlJc w:val="left"/>
+      <w:pPr>
+        <w:tabs>
+          <w:tab w:val="num" w:pos="6480"/>
+        </w:tabs>
+        <w:ind w:left="6480" w:hanging="360"/>
+      </w:pPr>
+    </w:lvl>
+  </w:abstractNum>
+  <w:abstractNum w:abstractNumId="17" w15:restartNumberingAfterBreak="0">
     <w:nsid w:val="694B2CB3"/>
     <w:multiLevelType w:val="multilevel"/>
     <w:tmpl w:val="2C4E165A"/>
@@ -6073,7 +9210,7 @@
       </w:rPr>
     </w:lvl>
   </w:abstractNum>
-  <w:abstractNum w:abstractNumId="13" w15:restartNumberingAfterBreak="0">
+  <w:abstractNum w:abstractNumId="18" w15:restartNumberingAfterBreak="0">
     <w:nsid w:val="71B44D50"/>
     <w:multiLevelType w:val="multilevel"/>
     <w:tmpl w:val="858CE994"/>
@@ -6191,46 +9328,61 @@
     </w:lvl>
   </w:abstractNum>
   <w:num w:numId="1" w16cid:durableId="1307777561">
+    <w:abstractNumId w:val="4"/>
+  </w:num>
+  <w:num w:numId="2" w16cid:durableId="791286800">
+    <w:abstractNumId w:val="14"/>
+  </w:num>
+  <w:num w:numId="3" w16cid:durableId="1838837574">
+    <w:abstractNumId w:val="13"/>
+  </w:num>
+  <w:num w:numId="4" w16cid:durableId="1940797212">
     <w:abstractNumId w:val="3"/>
   </w:num>
-  <w:num w:numId="2" w16cid:durableId="791286800">
-    <w:abstractNumId w:val="10"/>
-  </w:num>
-  <w:num w:numId="3" w16cid:durableId="1838837574">
-    <w:abstractNumId w:val="9"/>
-  </w:num>
-  <w:num w:numId="4" w16cid:durableId="1940797212">
-    <w:abstractNumId w:val="2"/>
-  </w:num>
   <w:num w:numId="5" w16cid:durableId="848833123">
-    <w:abstractNumId w:val="13"/>
+    <w:abstractNumId w:val="18"/>
   </w:num>
   <w:num w:numId="6" w16cid:durableId="1609851290">
-    <w:abstractNumId w:val="5"/>
+    <w:abstractNumId w:val="6"/>
   </w:num>
   <w:num w:numId="7" w16cid:durableId="1474523963">
     <w:abstractNumId w:val="0"/>
   </w:num>
   <w:num w:numId="8" w16cid:durableId="1910916369">
+    <w:abstractNumId w:val="17"/>
+  </w:num>
+  <w:num w:numId="9" w16cid:durableId="437141931">
+    <w:abstractNumId w:val="15"/>
+  </w:num>
+  <w:num w:numId="10" w16cid:durableId="124277906">
+    <w:abstractNumId w:val="2"/>
+  </w:num>
+  <w:num w:numId="11" w16cid:durableId="1284114975">
+    <w:abstractNumId w:val="8"/>
+  </w:num>
+  <w:num w:numId="12" w16cid:durableId="270817166">
+    <w:abstractNumId w:val="5"/>
+  </w:num>
+  <w:num w:numId="13" w16cid:durableId="713651445">
     <w:abstractNumId w:val="12"/>
   </w:num>
-  <w:num w:numId="9" w16cid:durableId="437141931">
+  <w:num w:numId="14" w16cid:durableId="262222873">
     <w:abstractNumId w:val="11"/>
   </w:num>
-  <w:num w:numId="10" w16cid:durableId="124277906">
+  <w:num w:numId="15" w16cid:durableId="80029539">
+    <w:abstractNumId w:val="10"/>
+  </w:num>
+  <w:num w:numId="16" w16cid:durableId="659506418">
+    <w:abstractNumId w:val="9"/>
+  </w:num>
+  <w:num w:numId="17" w16cid:durableId="1911302381">
+    <w:abstractNumId w:val="7"/>
+  </w:num>
+  <w:num w:numId="18" w16cid:durableId="458382191">
     <w:abstractNumId w:val="1"/>
   </w:num>
-  <w:num w:numId="11" w16cid:durableId="1284114975">
-    <w:abstractNumId w:val="6"/>
-  </w:num>
-  <w:num w:numId="12" w16cid:durableId="270817166">
-    <w:abstractNumId w:val="4"/>
-  </w:num>
-  <w:num w:numId="13" w16cid:durableId="713651445">
-    <w:abstractNumId w:val="8"/>
-  </w:num>
-  <w:num w:numId="14" w16cid:durableId="262222873">
-    <w:abstractNumId w:val="7"/>
+  <w:num w:numId="19" w16cid:durableId="1923023505">
+    <w:abstractNumId w:val="16"/>
   </w:num>
 </w:numbering>
 </file>
@@ -6663,7 +9815,6 @@
     <w:next w:val="Normal"/>
     <w:link w:val="Heading2Char"/>
     <w:uiPriority w:val="9"/>
-    <w:semiHidden/>
     <w:unhideWhenUsed/>
     <w:qFormat/>
     <w:rsid w:val="00CC71AF"/>
@@ -6879,7 +10030,6 @@
     <w:basedOn w:val="DefaultParagraphFont"/>
     <w:link w:val="Heading2"/>
     <w:uiPriority w:val="9"/>
-    <w:semiHidden/>
     <w:rsid w:val="00CC71AF"/>
     <w:rPr>
       <w:rFonts w:asciiTheme="majorHAnsi" w:eastAsiaTheme="majorEastAsia" w:hAnsiTheme="majorHAnsi" w:cstheme="majorBidi"/>
@@ -7447,4 +10597,16 @@
     </a:ext>
   </a:extLst>
 </a:theme>
+</file>
+
+<file path=customXml/item1.xml><?xml version="1.0" encoding="utf-8"?>
+<b:Sources xmlns:b="http://schemas.openxmlformats.org/officeDocument/2006/bibliography" xmlns="http://schemas.openxmlformats.org/officeDocument/2006/bibliography" SelectedStyle="\APASixthEditionOfficeOnline.xsl" StyleName="APA" Version="6"/>
+</file>
+
+<file path=customXml/itemProps1.xml><?xml version="1.0" encoding="utf-8"?>
+<ds:datastoreItem xmlns:ds="http://schemas.openxmlformats.org/officeDocument/2006/customXml" ds:itemID="{FBBE47C7-1348-41B9-8965-06C183C75956}">
+  <ds:schemaRefs>
+    <ds:schemaRef ds:uri="http://schemas.openxmlformats.org/officeDocument/2006/bibliography"/>
+  </ds:schemaRefs>
+</ds:datastoreItem>
 </file>
</xml_diff>